<commit_message>
manuale praticamente completo, manca solo da sistemare il sommario (dio cane)
</commit_message>
<xml_diff>
--- a/Documenti e diagrammi/doc/Manuale.docx
+++ b/Documenti e diagrammi/doc/Manuale.docx
@@ -32,8 +32,16 @@
         <w:rPr>
           <w:lang w:bidi="it-IT"/>
         </w:rPr>
-        <w:t>Progetto finale EiS</w:t>
+        <w:t xml:space="preserve">Progetto finale </w:t>
       </w:r>
+      <w:proofErr w:type="spellStart"/>
+      <w:r>
+        <w:rPr>
+          <w:lang w:bidi="it-IT"/>
+        </w:rPr>
+        <w:t>EiS</w:t>
+      </w:r>
+      <w:proofErr w:type="spellEnd"/>
     </w:p>
     <w:p>
       <w:pPr>
@@ -244,146 +252,8 @@
           <w:szCs w:val="32"/>
         </w:rPr>
         <w:lastRenderedPageBreak/>
-        <w:t>1. Requisiti di sistema</w:t>
+        <w:t>1</w:t>
       </w:r>
-    </w:p>
-    <w:p>
-      <w:pPr>
-        <w:pStyle w:val="Paragrafoelenco"/>
-        <w:numPr>
-          <w:ilvl w:val="0"/>
-          <w:numId w:val="12"/>
-        </w:numPr>
-        <w:spacing w:before="100" w:beforeAutospacing="1" w:after="100" w:afterAutospacing="1" w:line="240" w:lineRule="auto"/>
-      </w:pPr>
-      <w:r>
-        <w:rPr>
-          <w:b/>
-          <w:bCs/>
-        </w:rPr>
-        <w:t>Dipendenze software</w:t>
-      </w:r>
-    </w:p>
-    <w:p>
-      <w:pPr>
-        <w:pStyle w:val="Paragrafoelenco"/>
-        <w:spacing w:before="100" w:beforeAutospacing="1" w:after="100" w:afterAutospacing="1" w:line="240" w:lineRule="auto"/>
-      </w:pPr>
-      <w:r>
-        <w:t>Dev’essere installato il pacchetto Java SE 8 oppure Java JDK 8 sul dispositivo utilizzatore.</w:t>
-      </w:r>
-    </w:p>
-    <w:p>
-      <w:pPr>
-        <w:pStyle w:val="Paragrafoelenco"/>
-        <w:spacing w:before="100" w:beforeAutospacing="1" w:after="100" w:afterAutospacing="1" w:line="240" w:lineRule="auto"/>
-      </w:pPr>
-    </w:p>
-    <w:p>
-      <w:pPr>
-        <w:pStyle w:val="Paragrafoelenco"/>
-        <w:numPr>
-          <w:ilvl w:val="0"/>
-          <w:numId w:val="12"/>
-        </w:numPr>
-        <w:spacing w:before="100" w:beforeAutospacing="1" w:after="100" w:afterAutospacing="1" w:line="240" w:lineRule="auto"/>
-      </w:pPr>
-      <w:r>
-        <w:rPr>
-          <w:b/>
-          <w:bCs/>
-        </w:rPr>
-        <w:t>Memoria</w:t>
-      </w:r>
-    </w:p>
-    <w:p>
-      <w:pPr>
-        <w:pStyle w:val="Paragrafoelenco"/>
-        <w:spacing w:before="100" w:beforeAutospacing="1" w:after="100" w:afterAutospacing="1" w:line="240" w:lineRule="auto"/>
-      </w:pPr>
-      <w:r>
-        <w:t>Il sistema richiede una quantità di memoria minima per gestire il caricamento e l’elaborazione dei file degli articoli e dei termini estratti.</w:t>
-      </w:r>
-    </w:p>
-    <w:p>
-      <w:pPr>
-        <w:pStyle w:val="Paragrafoelenco"/>
-        <w:spacing w:before="100" w:beforeAutospacing="1" w:after="100" w:afterAutospacing="1" w:line="240" w:lineRule="auto"/>
-      </w:pPr>
-    </w:p>
-    <w:p>
-      <w:pPr>
-        <w:pStyle w:val="Paragrafoelenco"/>
-        <w:numPr>
-          <w:ilvl w:val="0"/>
-          <w:numId w:val="12"/>
-        </w:numPr>
-        <w:spacing w:before="100" w:beforeAutospacing="1" w:after="100" w:afterAutospacing="1" w:line="240" w:lineRule="auto"/>
-      </w:pPr>
-      <w:r>
-        <w:rPr>
-          <w:b/>
-          <w:bCs/>
-        </w:rPr>
-        <w:t>Spazio di archiviazione</w:t>
-      </w:r>
-    </w:p>
-    <w:p>
-      <w:pPr>
-        <w:pStyle w:val="Paragrafoelenco"/>
-        <w:spacing w:before="100" w:beforeAutospacing="1" w:after="100" w:afterAutospacing="1" w:line="240" w:lineRule="auto"/>
-      </w:pPr>
-      <w:r>
-        <w:t>Il sistema richiede uno spazio di archiviazione minimo per memorizzare i file degli articoli scaricati, i file dei termini estratti e altri dati correlati.</w:t>
-      </w:r>
-    </w:p>
-    <w:p>
-      <w:pPr>
-        <w:pStyle w:val="Paragrafoelenco"/>
-        <w:spacing w:before="100" w:beforeAutospacing="1" w:after="100" w:afterAutospacing="1" w:line="240" w:lineRule="auto"/>
-      </w:pPr>
-    </w:p>
-    <w:p>
-      <w:pPr>
-        <w:pStyle w:val="Paragrafoelenco"/>
-        <w:numPr>
-          <w:ilvl w:val="0"/>
-          <w:numId w:val="12"/>
-        </w:numPr>
-        <w:spacing w:before="100" w:beforeAutospacing="1" w:after="100" w:afterAutospacing="1" w:line="240" w:lineRule="auto"/>
-      </w:pPr>
-      <w:r>
-        <w:rPr>
-          <w:b/>
-          <w:bCs/>
-        </w:rPr>
-        <w:t>Risorse di rete</w:t>
-      </w:r>
-    </w:p>
-    <w:p>
-      <w:pPr>
-        <w:pStyle w:val="Paragrafoelenco"/>
-        <w:spacing w:before="100" w:beforeAutospacing="1" w:after="100" w:afterAutospacing="1" w:line="240" w:lineRule="auto"/>
-      </w:pPr>
-      <w:r>
-        <w:t>Il sistema richiede una connessione ad Internet attiva per il download degli articoli tramite l’API The Guardian e per eventuali altre fonti di articoli online.</w:t>
-      </w:r>
-    </w:p>
-    <w:p>
-      <w:pPr>
-        <w:pStyle w:val="Paragrafoelenco"/>
-        <w:spacing w:before="100" w:beforeAutospacing="1" w:after="100" w:afterAutospacing="1" w:line="240" w:lineRule="auto"/>
-      </w:pPr>
-    </w:p>
-    <w:p>
-      <w:pPr>
-        <w:rPr>
-          <w:b/>
-          <w:bCs/>
-          <w:sz w:val="32"/>
-          <w:szCs w:val="32"/>
-        </w:rPr>
-      </w:pPr>
       <w:r>
         <w:rPr>
           <w:b/>
@@ -391,11 +261,72 @@
           <w:sz w:val="32"/>
           <w:szCs w:val="32"/>
         </w:rPr>
-        <w:t>2. Installazione</w:t>
+        <w:t>. Finalità del software</w:t>
       </w:r>
     </w:p>
     <w:p>
       <w:pPr>
+        <w:ind w:left="425"/>
+        <w:jc w:val="both"/>
+      </w:pPr>
+      <w:r>
+        <w:t>L'applicazione offre la possibilità di scaricare e archiviare comodamente e in maniera locale fino a 2000 articoli. Ciò include 1000 articoli provenienti da file CSV e 1000 articoli ottenuti tramite richieste all'API del The Guardian. Per effettuare queste richieste, è necessario utilizzare una chiave API personale e il programma leggerà e scriverà i dati in un file JSON.</w:t>
+      </w:r>
+    </w:p>
+    <w:p>
+      <w:pPr>
+        <w:ind w:left="425"/>
+        <w:jc w:val="both"/>
+      </w:pPr>
+      <w:r>
+        <w:t xml:space="preserve">Il programma è, inoltre, capace di estrarre i </w:t>
+      </w:r>
+      <w:r>
+        <w:t xml:space="preserve">50 </w:t>
+      </w:r>
+      <w:r>
+        <w:t>termini più “importanti” per ordine di peso nell’insieme degli articoli scaricati</w:t>
+      </w:r>
+      <w:r>
+        <w:t xml:space="preserve"> e scrivere i risultati in un file di testo.</w:t>
+      </w:r>
+    </w:p>
+    <w:p/>
+    <w:p>
+      <w:pPr>
+        <w:rPr>
+          <w:b/>
+          <w:bCs/>
+          <w:sz w:val="32"/>
+          <w:szCs w:val="32"/>
+        </w:rPr>
+      </w:pPr>
+      <w:r>
+        <w:rPr>
+          <w:b/>
+          <w:bCs/>
+          <w:sz w:val="32"/>
+          <w:szCs w:val="32"/>
+        </w:rPr>
+        <w:t>2</w:t>
+      </w:r>
+      <w:r>
+        <w:rPr>
+          <w:b/>
+          <w:bCs/>
+          <w:sz w:val="32"/>
+          <w:szCs w:val="32"/>
+        </w:rPr>
+        <w:t>. Funzionalità</w:t>
+      </w:r>
+    </w:p>
+    <w:p>
+      <w:pPr>
+        <w:numPr>
+          <w:ilvl w:val="0"/>
+          <w:numId w:val="16"/>
+        </w:numPr>
+        <w:ind w:left="425"/>
         <w:rPr>
           <w:b/>
           <w:bCs/>
@@ -410,15 +341,1001 @@
           <w:sz w:val="24"/>
           <w:szCs w:val="24"/>
         </w:rPr>
-        <w:t>2.1 Operazioni preliminari</w:t>
+        <w:t>Download di articoli dall’API The Guardian</w:t>
       </w:r>
     </w:p>
     <w:p>
       <w:pPr>
+        <w:tabs>
+          <w:tab w:val="left" w:pos="420"/>
+        </w:tabs>
+        <w:spacing w:before="0"/>
+        <w:ind w:left="425"/>
+        <w:jc w:val="both"/>
+      </w:pPr>
+      <w:r>
+        <w:t xml:space="preserve">Il programma consente </w:t>
+      </w:r>
+      <w:r>
+        <w:t xml:space="preserve">di ottenere e deserializzare articoli </w:t>
+      </w:r>
+      <w:r>
+        <w:t xml:space="preserve">provenienti dall’archivio del </w:t>
+      </w:r>
+      <w:r>
+        <w:t xml:space="preserve">The Guardian </w:t>
+      </w:r>
+      <w:r>
+        <w:t>in base a una o più parole chiave, che vengono restituiti per ordine di rilevanza</w:t>
+      </w:r>
+      <w:r>
+        <w:t xml:space="preserve">, tramite l’utilizzo dell’API </w:t>
+      </w:r>
+      <w:r>
+        <w:t xml:space="preserve">(Application Programming Interface) </w:t>
+      </w:r>
+      <w:r>
+        <w:t xml:space="preserve">messa a disposizione dal quotidiano. L’accesso all’API necessita di una chiave API; ne viene fornita una di default nel file </w:t>
+      </w:r>
+    </w:p>
+    <w:p>
+      <w:pPr>
+        <w:tabs>
+          <w:tab w:val="left" w:pos="420"/>
+        </w:tabs>
+        <w:spacing w:before="0"/>
+        <w:ind w:left="425"/>
+        <w:jc w:val="both"/>
+        <w:rPr>
+          <w:lang w:val="en-US"/>
+        </w:rPr>
+      </w:pPr>
+      <w:r>
+        <w:rPr>
+          <w:lang w:val="en-US"/>
+        </w:rPr>
+        <w:t xml:space="preserve">“[directory </w:t>
+      </w:r>
+      <w:proofErr w:type="spellStart"/>
+      <w:r>
+        <w:rPr>
+          <w:lang w:val="en-US"/>
+        </w:rPr>
+        <w:t>programma</w:t>
+      </w:r>
+      <w:proofErr w:type="spellEnd"/>
+      <w:r>
+        <w:rPr>
+          <w:lang w:val="en-US"/>
+        </w:rPr>
+        <w:t>]/</w:t>
+      </w:r>
+      <w:r>
+        <w:rPr>
+          <w:lang w:val="en-US"/>
+        </w:rPr>
+        <w:t>Sources/TheGuardianAPIKey.txt”</w:t>
+      </w:r>
+      <w:r>
+        <w:rPr>
+          <w:lang w:val="en-US"/>
+        </w:rPr>
+        <w:t>.</w:t>
+      </w:r>
+    </w:p>
+    <w:p>
+      <w:pPr>
+        <w:numPr>
+          <w:ilvl w:val="0"/>
+          <w:numId w:val="16"/>
+        </w:numPr>
+        <w:ind w:left="425"/>
+        <w:rPr>
+          <w:b/>
+          <w:bCs/>
+          <w:sz w:val="24"/>
+          <w:szCs w:val="24"/>
+        </w:rPr>
+      </w:pPr>
+      <w:r>
+        <w:rPr>
+          <w:b/>
+          <w:bCs/>
+          <w:sz w:val="24"/>
+          <w:szCs w:val="24"/>
+        </w:rPr>
+        <w:t>Lettura di articoli da file CSV</w:t>
+      </w:r>
+    </w:p>
+    <w:p>
+      <w:pPr>
+        <w:tabs>
+          <w:tab w:val="left" w:pos="420"/>
+        </w:tabs>
+        <w:spacing w:before="0"/>
+        <w:ind w:left="425"/>
+        <w:jc w:val="both"/>
+      </w:pPr>
+      <w:r>
+        <w:t xml:space="preserve">Il programma supporta la lettura e </w:t>
+      </w:r>
+      <w:proofErr w:type="spellStart"/>
+      <w:r>
+        <w:t>deserializzazione</w:t>
+      </w:r>
+      <w:proofErr w:type="spellEnd"/>
+      <w:r>
+        <w:t xml:space="preserve"> di articoli salvati su file in formato CSV</w:t>
+      </w:r>
+      <w:r>
+        <w:t xml:space="preserve"> (Comma </w:t>
+      </w:r>
+      <w:proofErr w:type="spellStart"/>
+      <w:r>
+        <w:t>Separated</w:t>
+      </w:r>
+      <w:proofErr w:type="spellEnd"/>
+      <w:r>
+        <w:t xml:space="preserve"> Value)</w:t>
+      </w:r>
+      <w:r>
+        <w:t>,</w:t>
+      </w:r>
+      <w:r>
+        <w:t xml:space="preserve"> opportunamente predisposti</w:t>
+      </w:r>
+      <w:r>
+        <w:t xml:space="preserve"> e salvati</w:t>
+      </w:r>
+      <w:r>
+        <w:t xml:space="preserve"> </w:t>
+      </w:r>
+      <w:r>
+        <w:t>in</w:t>
+      </w:r>
+      <w:r>
+        <w:t xml:space="preserve"> “[directory programma]/Sources/CSV”.</w:t>
+      </w:r>
+    </w:p>
+    <w:p>
+      <w:pPr>
+        <w:numPr>
+          <w:ilvl w:val="0"/>
+          <w:numId w:val="16"/>
+        </w:numPr>
+        <w:ind w:left="425"/>
+        <w:rPr>
+          <w:sz w:val="24"/>
+          <w:szCs w:val="24"/>
+        </w:rPr>
+      </w:pPr>
+      <w:r>
+        <w:rPr>
+          <w:b/>
+          <w:bCs/>
+          <w:sz w:val="24"/>
+          <w:szCs w:val="24"/>
+        </w:rPr>
+        <w:t xml:space="preserve">Serializzazione degli articoli letti </w:t>
+      </w:r>
+    </w:p>
+    <w:p>
+      <w:pPr>
+        <w:tabs>
+          <w:tab w:val="left" w:pos="420"/>
+        </w:tabs>
+        <w:spacing w:before="0"/>
+        <w:ind w:left="425"/>
+        <w:jc w:val="both"/>
+      </w:pPr>
+      <w:r>
+        <w:t xml:space="preserve">Il programma effettua una serializzazione degli articoli scaricati dalle diverse sorgenti in un formato comune comprendente un ID alfanumerico in formato UUID generato casualmente e titolo e testo completi dell’articolo. Gli articoli vengono poi salvati in formato JSON </w:t>
+      </w:r>
+      <w:r>
+        <w:t xml:space="preserve">(JavaScript Object </w:t>
+      </w:r>
+      <w:proofErr w:type="spellStart"/>
+      <w:r>
+        <w:t>Notation</w:t>
+      </w:r>
+      <w:proofErr w:type="spellEnd"/>
+      <w:r>
+        <w:t xml:space="preserve">) </w:t>
+      </w:r>
+      <w:r>
+        <w:t>nel file</w:t>
+      </w:r>
+      <w:r>
+        <w:t xml:space="preserve"> “</w:t>
+      </w:r>
+      <w:r>
+        <w:t>[</w:t>
+      </w:r>
+      <w:r>
+        <w:t xml:space="preserve">directory </w:t>
+      </w:r>
+      <w:r>
+        <w:t>programma</w:t>
+      </w:r>
+      <w:r>
+        <w:t>]/Storage</w:t>
+      </w:r>
+      <w:r>
+        <w:t>/</w:t>
+      </w:r>
+      <w:proofErr w:type="spellStart"/>
+      <w:r>
+        <w:t>articles.json</w:t>
+      </w:r>
+      <w:proofErr w:type="spellEnd"/>
+      <w:r>
+        <w:t>”</w:t>
+      </w:r>
+      <w:r>
+        <w:t>.</w:t>
+      </w:r>
+    </w:p>
+    <w:p>
+      <w:pPr>
+        <w:numPr>
+          <w:ilvl w:val="0"/>
+          <w:numId w:val="16"/>
+        </w:numPr>
+        <w:ind w:left="425"/>
+        <w:rPr>
+          <w:sz w:val="24"/>
+          <w:szCs w:val="24"/>
+        </w:rPr>
+      </w:pPr>
+      <w:r>
+        <w:rPr>
+          <w:b/>
+          <w:bCs/>
+          <w:sz w:val="24"/>
+          <w:szCs w:val="24"/>
+        </w:rPr>
+        <w:t>Estrazione del peso dei termini che compaiono negli articoli</w:t>
+      </w:r>
+    </w:p>
+    <w:p>
+      <w:pPr>
+        <w:tabs>
+          <w:tab w:val="left" w:pos="420"/>
+        </w:tabs>
+        <w:spacing w:before="0"/>
+        <w:ind w:left="425"/>
+        <w:jc w:val="both"/>
+      </w:pPr>
+      <w:r>
+        <w:t xml:space="preserve">Il programma consente di analizzare il contenuto di tutti gli articoli salvati ed estrarre il peso (numero totale di istanze) di ogni termine che compare al loro interno. Viene utilizzata una stop list per “filtrare” le parole di poco interesse (es. congiunzioni, avverbi, </w:t>
+      </w:r>
+      <w:r>
+        <w:t>articoli, etc.).</w:t>
+      </w:r>
+    </w:p>
+    <w:p>
+      <w:pPr>
+        <w:numPr>
+          <w:ilvl w:val="0"/>
+          <w:numId w:val="16"/>
+        </w:numPr>
+        <w:ind w:left="425"/>
+        <w:rPr>
+          <w:sz w:val="24"/>
+          <w:szCs w:val="24"/>
+        </w:rPr>
+      </w:pPr>
+      <w:r>
+        <w:rPr>
+          <w:b/>
+          <w:bCs/>
+          <w:sz w:val="24"/>
+          <w:szCs w:val="24"/>
+        </w:rPr>
+        <w:t>Salvataggio su file dei termini più rilevanti</w:t>
+      </w:r>
+    </w:p>
+    <w:p>
+      <w:pPr>
+        <w:tabs>
+          <w:tab w:val="left" w:pos="420"/>
+        </w:tabs>
+        <w:spacing w:before="0"/>
+        <w:ind w:left="425"/>
+        <w:jc w:val="both"/>
+      </w:pPr>
+      <w:r>
+        <w:t xml:space="preserve">Il programma effettua </w:t>
+      </w:r>
+      <w:r>
+        <w:t>il salvataggio nel file</w:t>
+      </w:r>
+      <w:r>
+        <w:t xml:space="preserve"> “[directory programma]/Storage/terms.txt”</w:t>
+      </w:r>
+      <w:r>
+        <w:t xml:space="preserve"> dei 50 termini con peso maggiore, ordinati alfabeticamente in caso di pesi uguali.</w:t>
+      </w:r>
+    </w:p>
+    <w:p>
+      <w:pPr>
+        <w:numPr>
+          <w:ilvl w:val="0"/>
+          <w:numId w:val="16"/>
+        </w:numPr>
+        <w:ind w:left="425"/>
+        <w:rPr>
+          <w:sz w:val="24"/>
+          <w:szCs w:val="24"/>
+          <w:u w:val="single"/>
+        </w:rPr>
+      </w:pPr>
+      <w:r>
+        <w:rPr>
+          <w:b/>
+          <w:bCs/>
+          <w:sz w:val="24"/>
+          <w:szCs w:val="24"/>
+        </w:rPr>
+        <w:t>Esecuzione da riga di comando</w:t>
+      </w:r>
+    </w:p>
+    <w:p>
+      <w:pPr>
+        <w:tabs>
+          <w:tab w:val="left" w:pos="420"/>
+        </w:tabs>
+        <w:spacing w:before="0"/>
+        <w:ind w:left="425"/>
+        <w:jc w:val="both"/>
+      </w:pPr>
+      <w:r>
+        <w:t>Il programma è eseguibile tramite terminale a riga di comando (CLI) e supporta diverse opzioni di esecuzione</w:t>
+      </w:r>
+      <w:r>
+        <w:t>:</w:t>
+      </w:r>
+    </w:p>
+    <w:p>
+      <w:pPr>
         <w:pStyle w:val="Paragrafoelenco"/>
         <w:numPr>
           <w:ilvl w:val="0"/>
-          <w:numId w:val="12"/>
+          <w:numId w:val="21"/>
+        </w:numPr>
+        <w:tabs>
+          <w:tab w:val="left" w:pos="420"/>
+        </w:tabs>
+        <w:spacing w:before="0"/>
+        <w:jc w:val="both"/>
+      </w:pPr>
+      <w:r>
+        <w:t>-d “[query]”: download e serializza</w:t>
+      </w:r>
+      <w:r>
+        <w:t>zione degli articoli contenuti nei file CSV e ottenuti dall’API The Guardian utilizzando la query indicata come termine/i di ricerca;</w:t>
+      </w:r>
+    </w:p>
+    <w:p>
+      <w:pPr>
+        <w:pStyle w:val="Paragrafoelenco"/>
+        <w:numPr>
+          <w:ilvl w:val="0"/>
+          <w:numId w:val="21"/>
+        </w:numPr>
+        <w:tabs>
+          <w:tab w:val="left" w:pos="420"/>
+        </w:tabs>
+        <w:spacing w:before="0"/>
+        <w:jc w:val="both"/>
+      </w:pPr>
+      <w:r>
+        <w:t>-e: estrazione e salvataggio su file dei 50 termini con peso maggiore;</w:t>
+      </w:r>
+    </w:p>
+    <w:p>
+      <w:pPr>
+        <w:pStyle w:val="Paragrafoelenco"/>
+        <w:numPr>
+          <w:ilvl w:val="0"/>
+          <w:numId w:val="21"/>
+        </w:numPr>
+        <w:tabs>
+          <w:tab w:val="left" w:pos="420"/>
+        </w:tabs>
+        <w:spacing w:before="0"/>
+        <w:jc w:val="both"/>
+      </w:pPr>
+      <w:r>
+        <w:t>-h: visualizzazione di un menù di aiuto contenente descrizioni dei comandi disponibili.</w:t>
+      </w:r>
+    </w:p>
+    <w:p>
+      <w:pPr>
+        <w:tabs>
+          <w:tab w:val="left" w:pos="420"/>
+        </w:tabs>
+        <w:spacing w:before="0"/>
+        <w:ind w:left="425"/>
+        <w:jc w:val="both"/>
+      </w:pPr>
+      <w:r>
+        <w:lastRenderedPageBreak/>
+        <w:t>I comandi -d e -e possono essere effettuati entrambi all’interno di una singola esecuzione, ma il comando -e non è utilizzabile se nessuna serializzazione degli articoli è stata effettuata o se il file contenente gli articoli è mancante o vuoto.</w:t>
+      </w:r>
+    </w:p>
+    <w:p>
+      <w:pPr>
+        <w:tabs>
+          <w:tab w:val="left" w:pos="420"/>
+        </w:tabs>
+      </w:pPr>
+    </w:p>
+    <w:p>
+      <w:pPr>
+        <w:rPr>
+          <w:b/>
+          <w:bCs/>
+          <w:sz w:val="32"/>
+          <w:szCs w:val="32"/>
+        </w:rPr>
+      </w:pPr>
+      <w:r>
+        <w:rPr>
+          <w:b/>
+          <w:bCs/>
+          <w:sz w:val="32"/>
+          <w:szCs w:val="32"/>
+        </w:rPr>
+        <w:t>3</w:t>
+      </w:r>
+      <w:r>
+        <w:rPr>
+          <w:b/>
+          <w:bCs/>
+          <w:sz w:val="32"/>
+          <w:szCs w:val="32"/>
+        </w:rPr>
+        <w:t>. Librerie utilizzate</w:t>
+      </w:r>
+    </w:p>
+    <w:p>
+      <w:pPr>
+        <w:numPr>
+          <w:ilvl w:val="0"/>
+          <w:numId w:val="16"/>
+        </w:numPr>
+        <w:ind w:left="426"/>
+        <w:rPr>
+          <w:sz w:val="24"/>
+          <w:szCs w:val="24"/>
+        </w:rPr>
+      </w:pPr>
+      <w:r>
+        <w:rPr>
+          <w:b/>
+          <w:bCs/>
+          <w:sz w:val="24"/>
+          <w:szCs w:val="24"/>
+        </w:rPr>
+        <w:t>Apache Commons CLI</w:t>
+      </w:r>
+      <w:r>
+        <w:rPr>
+          <w:b/>
+          <w:bCs/>
+          <w:sz w:val="24"/>
+          <w:szCs w:val="24"/>
+        </w:rPr>
+        <w:t xml:space="preserve"> </w:t>
+      </w:r>
+      <w:r>
+        <w:rPr>
+          <w:b/>
+          <w:bCs/>
+          <w:sz w:val="24"/>
+          <w:szCs w:val="24"/>
+        </w:rPr>
+        <w:t>(</w:t>
+      </w:r>
+      <w:r>
+        <w:rPr>
+          <w:b/>
+          <w:bCs/>
+          <w:sz w:val="24"/>
+          <w:szCs w:val="24"/>
+        </w:rPr>
+        <w:t>1.5.0</w:t>
+      </w:r>
+      <w:r>
+        <w:rPr>
+          <w:b/>
+          <w:bCs/>
+          <w:sz w:val="24"/>
+          <w:szCs w:val="24"/>
+        </w:rPr>
+        <w:t>)</w:t>
+      </w:r>
+    </w:p>
+    <w:p>
+      <w:pPr>
+        <w:tabs>
+          <w:tab w:val="left" w:pos="420"/>
+        </w:tabs>
+        <w:spacing w:before="0"/>
+        <w:ind w:left="425"/>
+        <w:jc w:val="both"/>
+      </w:pPr>
+      <w:r>
+        <w:t xml:space="preserve">Libreria per il </w:t>
+      </w:r>
+      <w:proofErr w:type="spellStart"/>
+      <w:r>
+        <w:t>parsing</w:t>
+      </w:r>
+      <w:proofErr w:type="spellEnd"/>
+      <w:r>
+        <w:t xml:space="preserve"> degli argomenti da riga di comando. </w:t>
+      </w:r>
+    </w:p>
+    <w:p>
+      <w:pPr>
+        <w:numPr>
+          <w:ilvl w:val="0"/>
+          <w:numId w:val="16"/>
+        </w:numPr>
+        <w:ind w:left="426"/>
+        <w:rPr>
+          <w:b/>
+          <w:bCs/>
+          <w:sz w:val="24"/>
+          <w:szCs w:val="24"/>
+        </w:rPr>
+      </w:pPr>
+      <w:proofErr w:type="spellStart"/>
+      <w:r>
+        <w:rPr>
+          <w:b/>
+          <w:bCs/>
+          <w:sz w:val="24"/>
+          <w:szCs w:val="24"/>
+        </w:rPr>
+        <w:t>Gson</w:t>
+      </w:r>
+      <w:proofErr w:type="spellEnd"/>
+      <w:r>
+        <w:rPr>
+          <w:b/>
+          <w:bCs/>
+          <w:sz w:val="24"/>
+          <w:szCs w:val="24"/>
+        </w:rPr>
+        <w:t xml:space="preserve"> (2.10)</w:t>
+      </w:r>
+    </w:p>
+    <w:p>
+      <w:pPr>
+        <w:tabs>
+          <w:tab w:val="left" w:pos="420"/>
+        </w:tabs>
+        <w:spacing w:before="0"/>
+        <w:ind w:left="425"/>
+        <w:jc w:val="both"/>
+      </w:pPr>
+      <w:r>
+        <w:t xml:space="preserve">Libreria per </w:t>
+      </w:r>
+      <w:r>
+        <w:t xml:space="preserve">la serializzazione e </w:t>
+      </w:r>
+      <w:proofErr w:type="spellStart"/>
+      <w:r>
+        <w:t>deserializzazione</w:t>
+      </w:r>
+      <w:proofErr w:type="spellEnd"/>
+      <w:r>
+        <w:t xml:space="preserve"> di dati in (e da) file JSON.</w:t>
+      </w:r>
+    </w:p>
+    <w:p>
+      <w:pPr>
+        <w:numPr>
+          <w:ilvl w:val="0"/>
+          <w:numId w:val="16"/>
+        </w:numPr>
+        <w:ind w:left="426"/>
+        <w:rPr>
+          <w:b/>
+          <w:bCs/>
+          <w:sz w:val="24"/>
+          <w:szCs w:val="24"/>
+        </w:rPr>
+      </w:pPr>
+      <w:r>
+        <w:rPr>
+          <w:b/>
+          <w:bCs/>
+          <w:sz w:val="24"/>
+          <w:szCs w:val="24"/>
+        </w:rPr>
+        <w:t>Apache Commons CSV</w:t>
+      </w:r>
+      <w:r>
+        <w:rPr>
+          <w:b/>
+          <w:bCs/>
+          <w:sz w:val="24"/>
+          <w:szCs w:val="24"/>
+        </w:rPr>
+        <w:t xml:space="preserve"> (1.10.0)</w:t>
+      </w:r>
+    </w:p>
+    <w:p>
+      <w:pPr>
+        <w:tabs>
+          <w:tab w:val="left" w:pos="420"/>
+        </w:tabs>
+        <w:spacing w:before="0"/>
+        <w:ind w:left="425"/>
+        <w:jc w:val="both"/>
+      </w:pPr>
+      <w:r>
+        <w:t>Libreria per la lettura di dati da file CSV.</w:t>
+      </w:r>
+    </w:p>
+    <w:p>
+      <w:pPr>
+        <w:numPr>
+          <w:ilvl w:val="0"/>
+          <w:numId w:val="16"/>
+        </w:numPr>
+        <w:ind w:left="426"/>
+        <w:rPr>
+          <w:b/>
+          <w:bCs/>
+          <w:sz w:val="24"/>
+          <w:szCs w:val="24"/>
+          <w:lang w:val="en-US"/>
+        </w:rPr>
+      </w:pPr>
+      <w:proofErr w:type="spellStart"/>
+      <w:r>
+        <w:rPr>
+          <w:b/>
+          <w:bCs/>
+          <w:sz w:val="24"/>
+          <w:szCs w:val="24"/>
+          <w:lang w:val="en-US"/>
+        </w:rPr>
+        <w:t>Unirest</w:t>
+      </w:r>
+      <w:proofErr w:type="spellEnd"/>
+      <w:r>
+        <w:rPr>
+          <w:b/>
+          <w:bCs/>
+          <w:sz w:val="24"/>
+          <w:szCs w:val="24"/>
+          <w:lang w:val="en-US"/>
+        </w:rPr>
+        <w:t xml:space="preserve"> (1.4.9), Jackson Core (2.12.7.1)</w:t>
+      </w:r>
+    </w:p>
+    <w:p>
+      <w:pPr>
+        <w:tabs>
+          <w:tab w:val="left" w:pos="420"/>
+        </w:tabs>
+        <w:spacing w:before="0"/>
+        <w:ind w:left="425"/>
+        <w:jc w:val="both"/>
+      </w:pPr>
+      <w:r>
+        <w:t xml:space="preserve">Librerie utilizzate dal client </w:t>
+      </w:r>
+      <w:proofErr w:type="spellStart"/>
+      <w:r>
+        <w:t>G</w:t>
+      </w:r>
+      <w:r>
+        <w:t>uardianSourceAPI</w:t>
+      </w:r>
+      <w:proofErr w:type="spellEnd"/>
+      <w:r>
+        <w:t xml:space="preserve"> per gestire le richieste HTTP e le risposte in formato JSON.</w:t>
+      </w:r>
+    </w:p>
+    <w:p>
+      <w:pPr>
+        <w:tabs>
+          <w:tab w:val="left" w:pos="420"/>
+        </w:tabs>
+        <w:rPr>
+          <w:b/>
+          <w:bCs/>
+        </w:rPr>
+      </w:pPr>
+    </w:p>
+    <w:p>
+      <w:pPr>
+        <w:rPr>
+          <w:b/>
+          <w:bCs/>
+          <w:sz w:val="32"/>
+          <w:szCs w:val="32"/>
+        </w:rPr>
+      </w:pPr>
+      <w:r>
+        <w:rPr>
+          <w:b/>
+          <w:bCs/>
+          <w:sz w:val="32"/>
+          <w:szCs w:val="32"/>
+        </w:rPr>
+        <w:t>4.</w:t>
+      </w:r>
+      <w:r>
+        <w:rPr>
+          <w:b/>
+          <w:bCs/>
+          <w:sz w:val="32"/>
+          <w:szCs w:val="32"/>
+        </w:rPr>
+        <w:t xml:space="preserve"> </w:t>
+      </w:r>
+      <w:r>
+        <w:rPr>
+          <w:b/>
+          <w:bCs/>
+          <w:sz w:val="32"/>
+          <w:szCs w:val="32"/>
+        </w:rPr>
+        <w:t>Requisiti di sistema</w:t>
+      </w:r>
+    </w:p>
+    <w:p>
+      <w:pPr>
+        <w:numPr>
+          <w:ilvl w:val="0"/>
+          <w:numId w:val="16"/>
+        </w:numPr>
+        <w:ind w:left="426"/>
+        <w:rPr>
+          <w:b/>
+          <w:bCs/>
+          <w:sz w:val="24"/>
+          <w:szCs w:val="24"/>
+        </w:rPr>
+      </w:pPr>
+      <w:r>
+        <w:rPr>
+          <w:b/>
+          <w:bCs/>
+          <w:sz w:val="24"/>
+          <w:szCs w:val="24"/>
+        </w:rPr>
+        <w:t>Dipendenze software</w:t>
+      </w:r>
+    </w:p>
+    <w:p>
+      <w:pPr>
+        <w:pStyle w:val="Paragrafoelenco"/>
+        <w:spacing w:before="0" w:line="240" w:lineRule="auto"/>
+        <w:ind w:left="425"/>
+        <w:jc w:val="both"/>
+        <w:rPr>
+          <w:sz w:val="24"/>
+          <w:szCs w:val="24"/>
+        </w:rPr>
+      </w:pPr>
+      <w:r>
+        <w:t>Dev’essere installato il pacchetto Java SE 8 oppure Java JDK 8 sul dispositivo utilizzatore.</w:t>
+      </w:r>
+    </w:p>
+    <w:p>
+      <w:pPr>
+        <w:numPr>
+          <w:ilvl w:val="0"/>
+          <w:numId w:val="16"/>
+        </w:numPr>
+        <w:ind w:left="426"/>
+        <w:rPr>
+          <w:b/>
+          <w:bCs/>
+          <w:sz w:val="24"/>
+          <w:szCs w:val="24"/>
+        </w:rPr>
+      </w:pPr>
+      <w:r>
+        <w:rPr>
+          <w:b/>
+          <w:bCs/>
+          <w:sz w:val="24"/>
+          <w:szCs w:val="24"/>
+        </w:rPr>
+        <w:t>Memoria</w:t>
+      </w:r>
+    </w:p>
+    <w:p>
+      <w:pPr>
+        <w:spacing w:before="0"/>
+        <w:ind w:left="425"/>
+        <w:jc w:val="both"/>
+        <w:rPr>
+          <w:b/>
+          <w:bCs/>
+          <w:sz w:val="24"/>
+          <w:szCs w:val="24"/>
+        </w:rPr>
+      </w:pPr>
+      <w:r>
+        <w:t>Il sistema richiede una quantità di memoria minima per gestire il caricamento e l’elaborazione dei file degli articoli e dei termini estratti.</w:t>
+      </w:r>
+    </w:p>
+    <w:p>
+      <w:pPr>
+        <w:numPr>
+          <w:ilvl w:val="0"/>
+          <w:numId w:val="16"/>
+        </w:numPr>
+        <w:ind w:left="426"/>
+        <w:rPr>
+          <w:b/>
+          <w:bCs/>
+          <w:sz w:val="24"/>
+          <w:szCs w:val="24"/>
+        </w:rPr>
+      </w:pPr>
+      <w:r>
+        <w:rPr>
+          <w:b/>
+          <w:bCs/>
+          <w:sz w:val="24"/>
+          <w:szCs w:val="24"/>
+        </w:rPr>
+        <w:t>Spazio di archiviazione</w:t>
+      </w:r>
+    </w:p>
+    <w:p>
+      <w:pPr>
+        <w:tabs>
+          <w:tab w:val="left" w:pos="420"/>
+        </w:tabs>
+        <w:spacing w:before="0"/>
+        <w:ind w:left="425"/>
+        <w:jc w:val="both"/>
+      </w:pPr>
+      <w:r>
+        <w:t>Il sistema richiede uno spazio di archiviazione minimo per memorizzare i file degli articoli scaricati, i file dei termini estratti e altri dati correlati</w:t>
+      </w:r>
+      <w:r>
+        <w:t>.</w:t>
+      </w:r>
+    </w:p>
+    <w:p>
+      <w:pPr>
+        <w:numPr>
+          <w:ilvl w:val="0"/>
+          <w:numId w:val="16"/>
+        </w:numPr>
+        <w:ind w:left="426"/>
+        <w:rPr>
+          <w:b/>
+          <w:bCs/>
+          <w:sz w:val="24"/>
+          <w:szCs w:val="24"/>
+          <w:lang w:val="en-US"/>
+        </w:rPr>
+      </w:pPr>
+      <w:proofErr w:type="spellStart"/>
+      <w:r>
+        <w:rPr>
+          <w:b/>
+          <w:bCs/>
+          <w:sz w:val="24"/>
+          <w:szCs w:val="24"/>
+          <w:lang w:val="en-US"/>
+        </w:rPr>
+        <w:t>Risorse</w:t>
+      </w:r>
+      <w:proofErr w:type="spellEnd"/>
+      <w:r>
+        <w:rPr>
+          <w:b/>
+          <w:bCs/>
+          <w:sz w:val="24"/>
+          <w:szCs w:val="24"/>
+          <w:lang w:val="en-US"/>
+        </w:rPr>
+        <w:t xml:space="preserve"> di rete</w:t>
+      </w:r>
+    </w:p>
+    <w:p>
+      <w:pPr>
+        <w:tabs>
+          <w:tab w:val="left" w:pos="420"/>
+        </w:tabs>
+        <w:spacing w:before="0"/>
+        <w:ind w:left="425"/>
+        <w:jc w:val="both"/>
+      </w:pPr>
+      <w:r>
+        <w:t>Il sistema richiede una connessione ad Internet attiva per il download degli articoli tramite l’API The Guardian e per eventuali altre fonti di articoli online</w:t>
+      </w:r>
+      <w:r>
+        <w:t>.</w:t>
+      </w:r>
+    </w:p>
+    <w:p>
+      <w:pPr>
+        <w:tabs>
+          <w:tab w:val="left" w:pos="420"/>
+        </w:tabs>
+        <w:jc w:val="both"/>
+      </w:pPr>
+    </w:p>
+    <w:p>
+      <w:pPr>
+        <w:rPr>
+          <w:b/>
+          <w:bCs/>
+          <w:sz w:val="32"/>
+          <w:szCs w:val="32"/>
+        </w:rPr>
+      </w:pPr>
+      <w:r>
+        <w:rPr>
+          <w:b/>
+          <w:bCs/>
+          <w:sz w:val="32"/>
+          <w:szCs w:val="32"/>
+        </w:rPr>
+        <w:t>5</w:t>
+      </w:r>
+      <w:r>
+        <w:rPr>
+          <w:b/>
+          <w:bCs/>
+          <w:sz w:val="32"/>
+          <w:szCs w:val="32"/>
+        </w:rPr>
+        <w:t>. Installazione</w:t>
+      </w:r>
+    </w:p>
+    <w:p>
+      <w:pPr>
+        <w:rPr>
+          <w:b/>
+          <w:bCs/>
+          <w:sz w:val="24"/>
+          <w:szCs w:val="24"/>
+        </w:rPr>
+      </w:pPr>
+      <w:r>
+        <w:rPr>
+          <w:b/>
+          <w:bCs/>
+          <w:sz w:val="28"/>
+          <w:szCs w:val="28"/>
+        </w:rPr>
+        <w:t>5</w:t>
+      </w:r>
+      <w:r>
+        <w:rPr>
+          <w:b/>
+          <w:bCs/>
+          <w:sz w:val="28"/>
+          <w:szCs w:val="28"/>
+        </w:rPr>
+        <w:t>.1 Operazioni preliminari</w:t>
+      </w:r>
+    </w:p>
+    <w:p>
+      <w:pPr>
+        <w:pStyle w:val="Paragrafoelenco"/>
+        <w:numPr>
+          <w:ilvl w:val="0"/>
+          <w:numId w:val="24"/>
         </w:numPr>
         <w:rPr>
           <w:sz w:val="24"/>
@@ -446,18 +1363,21 @@
     <w:p>
       <w:pPr>
         <w:pStyle w:val="Paragrafoelenco"/>
-      </w:pPr>
-    </w:p>
-    <w:p>
-      <w:pPr>
-        <w:pStyle w:val="Paragrafoelenco"/>
         <w:numPr>
           <w:ilvl w:val="0"/>
           <w:numId w:val="13"/>
         </w:numPr>
       </w:pPr>
       <w:r>
-        <w:t>Aprire il terminale del proprio sistema operativo e digitare “java -version”.</w:t>
+        <w:t>Aprire il terminale del proprio sistema operativo e digitare “java -</w:t>
+      </w:r>
+      <w:proofErr w:type="spellStart"/>
+      <w:r>
+        <w:t>version</w:t>
+      </w:r>
+      <w:proofErr w:type="spellEnd"/>
+      <w:r>
+        <w:t>”.</w:t>
       </w:r>
     </w:p>
     <w:p>
@@ -468,10 +1388,11 @@
         <w:rPr>
           <w:noProof/>
         </w:rPr>
+        <w:lastRenderedPageBreak/>
         <mc:AlternateContent>
           <mc:Choice Requires="wps">
             <w:drawing>
-              <wp:anchor distT="0" distB="0" distL="114300" distR="114300" simplePos="0" relativeHeight="251667456" behindDoc="0" locked="0" layoutInCell="1" allowOverlap="1" wp14:anchorId="42B5A527" wp14:editId="4D8DACBF">
+              <wp:anchor distT="0" distB="0" distL="114300" distR="114300" simplePos="0" relativeHeight="251667456" behindDoc="0" locked="0" layoutInCell="1" allowOverlap="1" wp14:anchorId="4DD1F7AC" wp14:editId="0B176811">
                 <wp:simplePos x="0" y="0"/>
                 <wp:positionH relativeFrom="column">
                   <wp:posOffset>3455035</wp:posOffset>
@@ -521,13 +1442,14 @@
               </wp:anchor>
             </w:drawing>
           </mc:Choice>
-          <mc:Fallback xmlns:wpsCustomData="http://www.wps.cn/officeDocument/2013/wpsCustomData">
+          <mc:Fallback>
             <w:pict>
-              <v:shape id="Connettore 2 1" o:spid="_x0000_s1026" o:spt="32" type="#_x0000_t32" style="position:absolute;left:0pt;flip:x;margin-left:272.05pt;margin-top:82.15pt;height:12pt;width:29.7pt;z-index:251667456;mso-width-relative:page;mso-height-relative:page;" filled="f" stroked="t" coordsize="21600,21600" o:gfxdata="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">
-                <v:fill on="f" focussize="0,0"/>
-                <v:stroke weight="4.5pt" color="#FF0000 [3205]" miterlimit="8" joinstyle="miter" endarrow="block"/>
-                <v:imagedata o:title=""/>
-                <o:lock v:ext="edit" aspectratio="f"/>
+              <v:shapetype w14:anchorId="5669C455" id="_x0000_t32" coordsize="21600,21600" o:spt="32" o:oned="t" path="m,l21600,21600e" filled="f">
+                <v:path arrowok="t" fillok="f" o:connecttype="none"/>
+                <o:lock v:ext="edit" shapetype="t"/>
+              </v:shapetype>
+              <v:shape id="Connettore 2 1" o:spid="_x0000_s1026" type="#_x0000_t32" style="position:absolute;margin-left:272.05pt;margin-top:82.15pt;width:29.7pt;height:12pt;flip:x;z-index:251667456;visibility:visible;mso-wrap-style:square;mso-wrap-distance-left:9pt;mso-wrap-distance-top:0;mso-wrap-distance-right:9pt;mso-wrap-distance-bottom:0;mso-position-horizontal:absolute;mso-position-horizontal-relative:text;mso-position-vertical:absolute;mso-position-vertical-relative:text" o:gfxdata="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" strokecolor="red [3205]" strokeweight="4.5pt">
+                <v:stroke endarrow="block" joinstyle="miter"/>
               </v:shape>
             </w:pict>
           </mc:Fallback>
@@ -540,7 +1462,7 @@
         <mc:AlternateContent>
           <mc:Choice Requires="wps">
             <w:drawing>
-              <wp:anchor distT="0" distB="0" distL="114300" distR="114300" simplePos="0" relativeHeight="251666432" behindDoc="0" locked="0" layoutInCell="1" allowOverlap="1" wp14:anchorId="4F290496" wp14:editId="73A1C93A">
+              <wp:anchor distT="0" distB="0" distL="114300" distR="114300" simplePos="0" relativeHeight="251666432" behindDoc="0" locked="0" layoutInCell="1" allowOverlap="1" wp14:anchorId="1BFFFAD7" wp14:editId="4646D974">
                 <wp:simplePos x="0" y="0"/>
                 <wp:positionH relativeFrom="column">
                   <wp:posOffset>2214880</wp:posOffset>
@@ -588,13 +1510,10 @@
               </wp:anchor>
             </w:drawing>
           </mc:Choice>
-          <mc:Fallback xmlns:wpsCustomData="http://www.wps.cn/officeDocument/2013/wpsCustomData">
+          <mc:Fallback>
             <w:pict>
-              <v:line id="Connettore diritto 2" o:spid="_x0000_s1026" o:spt="20" style="position:absolute;left:0pt;flip:y;margin-left:174.4pt;margin-top:101.65pt;height:0.45pt;width:96.35pt;z-index:251666432;mso-width-relative:page;mso-height-relative:page;" filled="f" stroked="t" coordsize="21600,21600" o:gfxdata="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">
-                <v:fill on="f" focussize="0,0"/>
-                <v:stroke weight="1.5pt" color="#FF0000 [3205]" miterlimit="8" joinstyle="miter"/>
-                <v:imagedata o:title=""/>
-                <o:lock v:ext="edit" aspectratio="f"/>
+              <v:line w14:anchorId="3E96ECEF" id="Connettore diritto 2" o:spid="_x0000_s1026" style="position:absolute;flip:y;z-index:251666432;visibility:visible;mso-wrap-style:square;mso-wrap-distance-left:9pt;mso-wrap-distance-top:0;mso-wrap-distance-right:9pt;mso-wrap-distance-bottom:0;mso-position-horizontal:absolute;mso-position-horizontal-relative:text;mso-position-vertical:absolute;mso-position-vertical-relative:text" from="174.4pt,101.65pt" to="270.75pt,102.1pt" o:gfxdata="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" strokecolor="red [3205]" strokeweight="1.5pt">
+                <v:stroke joinstyle="miter"/>
               </v:line>
             </w:pict>
           </mc:Fallback>
@@ -605,7 +1524,7 @@
           <w:noProof/>
         </w:rPr>
         <w:drawing>
-          <wp:inline distT="0" distB="0" distL="0" distR="0" wp14:anchorId="20B1B500" wp14:editId="5C798F73">
+          <wp:inline distT="0" distB="0" distL="0" distR="0" wp14:anchorId="27111EB2" wp14:editId="56D34730">
             <wp:extent cx="5242560" cy="1371600"/>
             <wp:effectExtent l="0" t="0" r="0" b="0"/>
             <wp:docPr id="776260156" name="Immagine 1" descr="Immagine che contiene testo, schermata, Carattere&#10;&#10;Descrizione generata automaticamente"/>
@@ -652,7 +1571,21 @@
         </w:numPr>
       </w:pPr>
       <w:r>
-        <w:t>Se il dispositivo dovesse disporre già di Java, verrà visualizzata una schermata nella quale vengono riportate la versione installata e l’ambiente di runtime (Java SE Runtime Environment). L’importante è che la versione sia pari o superiore alla “1.8.x_xxx”.</w:t>
+        <w:t xml:space="preserve">Se il dispositivo dovesse </w:t>
+      </w:r>
+      <w:r>
+        <w:t>già disporre</w:t>
+      </w:r>
+      <w:r>
+        <w:t xml:space="preserve"> di Java, verrà visualizzata una schermata nella quale vengono riportate la versione installata e l’ambiente di </w:t>
+      </w:r>
+      <w:proofErr w:type="spellStart"/>
+      <w:r>
+        <w:t>runtime</w:t>
+      </w:r>
+      <w:proofErr w:type="spellEnd"/>
+      <w:r>
+        <w:t xml:space="preserve"> (Java SE Runtime Environment). L’importante è che la versione sia pari o superiore alla “1.8.x_xxx”.</w:t>
       </w:r>
     </w:p>
     <w:p>
@@ -666,7 +1599,7 @@
         <mc:AlternateContent>
           <mc:Choice Requires="wps">
             <w:drawing>
-              <wp:anchor distT="0" distB="0" distL="114300" distR="114300" simplePos="0" relativeHeight="251659264" behindDoc="0" locked="0" layoutInCell="1" allowOverlap="1" wp14:anchorId="3E810F6F" wp14:editId="7839FB4C">
+              <wp:anchor distT="0" distB="0" distL="114300" distR="114300" simplePos="0" relativeHeight="251659264" behindDoc="0" locked="0" layoutInCell="1" allowOverlap="1" wp14:anchorId="025EE2F2" wp14:editId="0D34FD9D">
                 <wp:simplePos x="0" y="0"/>
                 <wp:positionH relativeFrom="column">
                   <wp:posOffset>3446145</wp:posOffset>
@@ -716,13 +1649,10 @@
               </wp:anchor>
             </w:drawing>
           </mc:Choice>
-          <mc:Fallback xmlns:wpsCustomData="http://www.wps.cn/officeDocument/2013/wpsCustomData">
+          <mc:Fallback>
             <w:pict>
-              <v:shape id="Connettore 2 1" o:spid="_x0000_s1026" o:spt="32" type="#_x0000_t32" style="position:absolute;left:0pt;flip:x;margin-left:271.35pt;margin-top:81.75pt;height:12pt;width:29.7pt;z-index:251659264;mso-width-relative:page;mso-height-relative:page;" filled="f" stroked="t" coordsize="21600,21600" o:gfxdata="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">
-                <v:fill on="f" focussize="0,0"/>
-                <v:stroke weight="4.5pt" color="#FF0000 [3205]" miterlimit="8" joinstyle="miter" endarrow="block"/>
-                <v:imagedata o:title=""/>
-                <o:lock v:ext="edit" aspectratio="f"/>
+              <v:shape w14:anchorId="645A25A1" id="Connettore 2 1" o:spid="_x0000_s1026" type="#_x0000_t32" style="position:absolute;margin-left:271.35pt;margin-top:81.75pt;width:29.7pt;height:12pt;flip:x;z-index:251659264;visibility:visible;mso-wrap-style:square;mso-wrap-distance-left:9pt;mso-wrap-distance-top:0;mso-wrap-distance-right:9pt;mso-wrap-distance-bottom:0;mso-position-horizontal:absolute;mso-position-horizontal-relative:text;mso-position-vertical:absolute;mso-position-vertical-relative:text" o:gfxdata="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" strokecolor="red [3205]" strokeweight="4.5pt">
+                <v:stroke endarrow="block" joinstyle="miter"/>
               </v:shape>
             </w:pict>
           </mc:Fallback>
@@ -735,7 +1665,7 @@
         <mc:AlternateContent>
           <mc:Choice Requires="wps">
             <w:drawing>
-              <wp:anchor distT="0" distB="0" distL="114300" distR="114300" simplePos="0" relativeHeight="251660288" behindDoc="0" locked="0" layoutInCell="1" allowOverlap="1" wp14:anchorId="636A9AFA" wp14:editId="0BC85924">
+              <wp:anchor distT="0" distB="0" distL="114300" distR="114300" simplePos="0" relativeHeight="251660288" behindDoc="0" locked="0" layoutInCell="1" allowOverlap="1" wp14:anchorId="44F21D25" wp14:editId="1754EC40">
                 <wp:simplePos x="0" y="0"/>
                 <wp:positionH relativeFrom="column">
                   <wp:posOffset>729615</wp:posOffset>
@@ -783,13 +1713,10 @@
               </wp:anchor>
             </w:drawing>
           </mc:Choice>
-          <mc:Fallback xmlns:wpsCustomData="http://www.wps.cn/officeDocument/2013/wpsCustomData">
+          <mc:Fallback>
             <w:pict>
-              <v:line id="Connettore diritto 2" o:spid="_x0000_s1026" o:spt="20" style="position:absolute;left:0pt;margin-left:57.45pt;margin-top:99.5pt;height:0pt;width:210.3pt;z-index:251660288;mso-width-relative:page;mso-height-relative:page;" filled="f" stroked="t" coordsize="21600,21600" o:gfxdata="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">
-                <v:fill on="f" focussize="0,0"/>
-                <v:stroke weight="1.5pt" color="#FF0000 [3205]" miterlimit="8" joinstyle="miter"/>
-                <v:imagedata o:title=""/>
-                <o:lock v:ext="edit" aspectratio="f"/>
+              <v:line w14:anchorId="02596428" id="Connettore diritto 2" o:spid="_x0000_s1026" style="position:absolute;z-index:251660288;visibility:visible;mso-wrap-style:square;mso-wrap-distance-left:9pt;mso-wrap-distance-top:0;mso-wrap-distance-right:9pt;mso-wrap-distance-bottom:0;mso-position-horizontal:absolute;mso-position-horizontal-relative:text;mso-position-vertical:absolute;mso-position-vertical-relative:text" from="57.45pt,99.5pt" to="267.75pt,99.5pt" o:gfxdata="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" strokecolor="red [3205]" strokeweight="1.5pt">
+                <v:stroke joinstyle="miter"/>
               </v:line>
             </w:pict>
           </mc:Fallback>
@@ -800,7 +1727,7 @@
           <w:noProof/>
         </w:rPr>
         <w:drawing>
-          <wp:inline distT="0" distB="0" distL="0" distR="0" wp14:anchorId="20107845" wp14:editId="32E2BFC4">
+          <wp:inline distT="0" distB="0" distL="0" distR="0" wp14:anchorId="2FF8194F" wp14:editId="5BEFBF2B">
             <wp:extent cx="6220460" cy="1561465"/>
             <wp:effectExtent l="0" t="0" r="0" b="635"/>
             <wp:docPr id="2109885165" name="Immagine 1" descr="Immagine che contiene testo, schermata, Carattere&#10;&#10;Descrizione generata automaticamente"/>
@@ -847,7 +1774,6 @@
         </w:numPr>
       </w:pPr>
       <w:r>
-        <w:lastRenderedPageBreak/>
         <w:t>In caso contrario, è possibile passare all’installazione di Java tramite il sito dedicato.</w:t>
       </w:r>
     </w:p>
@@ -862,7 +1788,7 @@
         <w:pStyle w:val="Paragrafoelenco"/>
         <w:numPr>
           <w:ilvl w:val="0"/>
-          <w:numId w:val="12"/>
+          <w:numId w:val="25"/>
         </w:numPr>
         <w:rPr>
           <w:sz w:val="24"/>
@@ -886,33 +1812,19 @@
           <w:ilvl w:val="0"/>
           <w:numId w:val="14"/>
         </w:numPr>
-        <w:rPr>
-          <w:sz w:val="24"/>
-          <w:szCs w:val="24"/>
-        </w:rPr>
       </w:pPr>
       <w:r>
-        <w:rPr>
-          <w:sz w:val="24"/>
-          <w:szCs w:val="24"/>
-        </w:rPr>
         <w:t>Aprire un qualsiasi browser e digitare nella barra degli indirizzi “</w:t>
       </w:r>
       <w:hyperlink r:id="rId11" w:history="1">
         <w:r>
           <w:rPr>
             <w:rStyle w:val="Collegamentoipertestuale"/>
-            <w:sz w:val="24"/>
-            <w:szCs w:val="24"/>
           </w:rPr>
           <w:t>https://www.java.com/it/</w:t>
         </w:r>
       </w:hyperlink>
       <w:r>
-        <w:rPr>
-          <w:sz w:val="24"/>
-          <w:szCs w:val="24"/>
-        </w:rPr>
         <w:t>”, oppure cliccare il link qui presente.</w:t>
       </w:r>
     </w:p>
@@ -923,37 +1835,23 @@
           <w:ilvl w:val="0"/>
           <w:numId w:val="14"/>
         </w:numPr>
-        <w:rPr>
-          <w:sz w:val="24"/>
-          <w:szCs w:val="24"/>
-        </w:rPr>
       </w:pPr>
       <w:r>
-        <w:rPr>
-          <w:sz w:val="24"/>
-          <w:szCs w:val="24"/>
-        </w:rPr>
         <w:t>Cliccare su “Scarica Java”.</w:t>
       </w:r>
     </w:p>
     <w:p>
       <w:pPr>
         <w:ind w:left="1080"/>
-        <w:rPr>
-          <w:sz w:val="24"/>
-          <w:szCs w:val="24"/>
-        </w:rPr>
       </w:pPr>
       <w:r>
         <w:rPr>
           <w:noProof/>
-          <w:sz w:val="24"/>
-          <w:szCs w:val="24"/>
         </w:rPr>
         <mc:AlternateContent>
           <mc:Choice Requires="wps">
             <w:drawing>
-              <wp:anchor distT="0" distB="0" distL="114300" distR="114300" simplePos="0" relativeHeight="251661312" behindDoc="0" locked="0" layoutInCell="1" allowOverlap="1" wp14:anchorId="3FE38DBB" wp14:editId="17C11C5F">
+              <wp:anchor distT="0" distB="0" distL="114300" distR="114300" simplePos="0" relativeHeight="251661312" behindDoc="0" locked="0" layoutInCell="1" allowOverlap="1" wp14:anchorId="1785BBCD" wp14:editId="00825F86">
                 <wp:simplePos x="0" y="0"/>
                 <wp:positionH relativeFrom="column">
                   <wp:posOffset>1940560</wp:posOffset>
@@ -1003,13 +1901,10 @@
               </wp:anchor>
             </w:drawing>
           </mc:Choice>
-          <mc:Fallback xmlns:wpsCustomData="http://www.wps.cn/officeDocument/2013/wpsCustomData">
+          <mc:Fallback>
             <w:pict>
-              <v:shape id="Connettore 2 3" o:spid="_x0000_s1026" o:spt="32" type="#_x0000_t32" style="position:absolute;left:0pt;flip:y;margin-left:152.8pt;margin-top:112.15pt;height:12pt;width:38.55pt;z-index:251661312;mso-width-relative:page;mso-height-relative:page;" filled="f" stroked="t" coordsize="21600,21600" o:gfxdata="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">
-                <v:fill on="f" focussize="0,0"/>
-                <v:stroke weight="4.5pt" color="#FF0000 [3205]" miterlimit="8" joinstyle="miter" endarrow="block"/>
-                <v:imagedata o:title=""/>
-                <o:lock v:ext="edit" aspectratio="f"/>
+              <v:shape w14:anchorId="6AC5E677" id="Connettore 2 3" o:spid="_x0000_s1026" type="#_x0000_t32" style="position:absolute;margin-left:152.8pt;margin-top:112.15pt;width:38.55pt;height:12pt;flip:y;z-index:251661312;visibility:visible;mso-wrap-style:square;mso-wrap-distance-left:9pt;mso-wrap-distance-top:0;mso-wrap-distance-right:9pt;mso-wrap-distance-bottom:0;mso-position-horizontal:absolute;mso-position-horizontal-relative:text;mso-position-vertical:absolute;mso-position-vertical-relative:text" o:gfxdata="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" strokecolor="red [3205]" strokeweight="4.5pt">
+                <v:stroke endarrow="block" joinstyle="miter"/>
               </v:shape>
             </w:pict>
           </mc:Fallback>
@@ -1018,11 +1913,9 @@
       <w:r>
         <w:rPr>
           <w:noProof/>
-          <w:sz w:val="24"/>
-          <w:szCs w:val="24"/>
         </w:rPr>
         <w:drawing>
-          <wp:inline distT="0" distB="0" distL="0" distR="0" wp14:anchorId="666A2F64" wp14:editId="68D4C6A8">
+          <wp:inline distT="0" distB="0" distL="0" distR="0" wp14:anchorId="24974610" wp14:editId="5A6797FF">
             <wp:extent cx="5326380" cy="1914051"/>
             <wp:effectExtent l="0" t="0" r="7620" b="0"/>
             <wp:docPr id="1554049537" name="Immagine 1" descr="Immagine che contiene testo, persona, Viso umano, Sito Web&#10;&#10;Descrizione generata automaticamente"/>
@@ -1071,51 +1964,24 @@
           <w:ilvl w:val="0"/>
           <w:numId w:val="14"/>
         </w:numPr>
-        <w:rPr>
-          <w:sz w:val="24"/>
-          <w:szCs w:val="24"/>
-        </w:rPr>
       </w:pPr>
       <w:r>
-        <w:rPr>
-          <w:sz w:val="24"/>
-          <w:szCs w:val="24"/>
-        </w:rPr>
-        <w:t xml:space="preserve">Il sito determinerà in maniera autonoma il vostro </w:t>
-      </w:r>
-      <w:r>
-        <w:rPr>
-          <w:sz w:val="24"/>
-          <w:szCs w:val="24"/>
-        </w:rPr>
-        <w:t>sistema</w:t>
-      </w:r>
-      <w:r>
-        <w:rPr>
-          <w:sz w:val="24"/>
-          <w:szCs w:val="24"/>
-        </w:rPr>
-        <w:t xml:space="preserve"> operativo: cliccare quindi su “Download Java” e attendere il completamento del download.</w:t>
+        <w:t>Il sito determinerà in maniera autonoma il vostro sistema operativo: cliccare quindi su “Download Java” e attendere il completamento del download.</w:t>
       </w:r>
     </w:p>
     <w:p>
       <w:pPr>
         <w:ind w:left="1080"/>
-        <w:rPr>
-          <w:sz w:val="24"/>
-          <w:szCs w:val="24"/>
-        </w:rPr>
       </w:pPr>
       <w:r>
         <w:rPr>
           <w:noProof/>
-          <w:sz w:val="24"/>
-          <w:szCs w:val="24"/>
         </w:rPr>
+        <w:lastRenderedPageBreak/>
         <mc:AlternateContent>
           <mc:Choice Requires="wps">
             <w:drawing>
-              <wp:anchor distT="0" distB="0" distL="114300" distR="114300" simplePos="0" relativeHeight="251662336" behindDoc="0" locked="0" layoutInCell="1" allowOverlap="1" wp14:anchorId="79CE7132" wp14:editId="7FD9940E">
+              <wp:anchor distT="0" distB="0" distL="114300" distR="114300" simplePos="0" relativeHeight="251662336" behindDoc="0" locked="0" layoutInCell="1" allowOverlap="1" wp14:anchorId="533F0237" wp14:editId="3344E1C8">
                 <wp:simplePos x="0" y="0"/>
                 <wp:positionH relativeFrom="column">
                   <wp:posOffset>4780280</wp:posOffset>
@@ -1165,13 +2031,10 @@
               </wp:anchor>
             </w:drawing>
           </mc:Choice>
-          <mc:Fallback xmlns:wpsCustomData="http://www.wps.cn/officeDocument/2013/wpsCustomData">
+          <mc:Fallback>
             <w:pict>
-              <v:shape id="Connettore 2 4" o:spid="_x0000_s1026" o:spt="32" type="#_x0000_t32" style="position:absolute;left:0pt;flip:x;margin-left:376.4pt;margin-top:172.7pt;height:14.2pt;width:36.45pt;z-index:251662336;mso-width-relative:page;mso-height-relative:page;" filled="f" stroked="t" coordsize="21600,21600" o:gfxdata="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">
-                <v:fill on="f" focussize="0,0"/>
-                <v:stroke weight="4.5pt" color="#FF0000 [3205]" miterlimit="8" joinstyle="miter" endarrow="block"/>
-                <v:imagedata o:title=""/>
-                <o:lock v:ext="edit" aspectratio="f"/>
+              <v:shape w14:anchorId="207D01B7" id="Connettore 2 4" o:spid="_x0000_s1026" type="#_x0000_t32" style="position:absolute;margin-left:376.4pt;margin-top:172.7pt;width:36.45pt;height:14.2pt;flip:x;z-index:251662336;visibility:visible;mso-wrap-style:square;mso-wrap-distance-left:9pt;mso-wrap-distance-top:0;mso-wrap-distance-right:9pt;mso-wrap-distance-bottom:0;mso-position-horizontal:absolute;mso-position-horizontal-relative:text;mso-position-vertical:absolute;mso-position-vertical-relative:text" o:gfxdata="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" strokecolor="red [3205]" strokeweight="4.5pt">
+                <v:stroke endarrow="block" joinstyle="miter"/>
               </v:shape>
             </w:pict>
           </mc:Fallback>
@@ -1180,11 +2043,9 @@
       <w:r>
         <w:rPr>
           <w:noProof/>
-          <w:sz w:val="24"/>
-          <w:szCs w:val="24"/>
         </w:rPr>
         <w:drawing>
-          <wp:inline distT="0" distB="0" distL="0" distR="0" wp14:anchorId="5911D7E4" wp14:editId="244569B9">
+          <wp:inline distT="0" distB="0" distL="0" distR="0" wp14:anchorId="74967B69" wp14:editId="4C096F78">
             <wp:extent cx="5315831" cy="2446020"/>
             <wp:effectExtent l="0" t="0" r="0" b="0"/>
             <wp:docPr id="912974182" name="Immagine 1" descr="Immagine che contiene testo, schermata, Pagina Web, Carattere&#10;&#10;Descrizione generata automaticamente"/>
@@ -1229,21 +2090,15 @@
     <w:p>
       <w:pPr>
         <w:ind w:left="1080"/>
-        <w:rPr>
-          <w:sz w:val="24"/>
-          <w:szCs w:val="24"/>
-        </w:rPr>
       </w:pPr>
       <w:r>
         <w:rPr>
           <w:noProof/>
-          <w:sz w:val="24"/>
-          <w:szCs w:val="24"/>
         </w:rPr>
         <mc:AlternateContent>
           <mc:Choice Requires="wps">
             <w:drawing>
-              <wp:anchor distT="0" distB="0" distL="114300" distR="114300" simplePos="0" relativeHeight="251663360" behindDoc="0" locked="0" layoutInCell="1" allowOverlap="1" wp14:anchorId="7DA605B7" wp14:editId="65363956">
+              <wp:anchor distT="0" distB="0" distL="114300" distR="114300" simplePos="0" relativeHeight="251663360" behindDoc="0" locked="0" layoutInCell="1" allowOverlap="1" wp14:anchorId="2106200B" wp14:editId="03080A7C">
                 <wp:simplePos x="0" y="0"/>
                 <wp:positionH relativeFrom="column">
                   <wp:posOffset>559435</wp:posOffset>
@@ -1302,14 +2157,9 @@
               </wp:anchor>
             </w:drawing>
           </mc:Choice>
-          <mc:Fallback xmlns:wpsCustomData="http://www.wps.cn/officeDocument/2013/wpsCustomData">
+          <mc:Fallback>
             <w:pict>
-              <v:shape id="Ovale 5" o:spid="_x0000_s1026" o:spt="3" type="#_x0000_t3" style="position:absolute;left:0pt;margin-left:44.05pt;margin-top:24.75pt;height:54.9pt;width:180pt;z-index:251663360;v-text-anchor:middle;mso-width-relative:page;mso-height-relative:page;" filled="f" stroked="t" coordsize="21600,21600" o:gfxdata="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">
-                <v:fill on="f" focussize="0,0"/>
-                <v:stroke weight="3pt" color="#FF0000 [3205]" joinstyle="round"/>
-                <v:imagedata o:title=""/>
-                <o:lock v:ext="edit" aspectratio="f"/>
-              </v:shape>
+              <v:oval w14:anchorId="1BCFFEB7" id="Ovale 5" o:spid="_x0000_s1026" style="position:absolute;margin-left:44.05pt;margin-top:24.75pt;width:180pt;height:54.9pt;z-index:251663360;visibility:visible;mso-wrap-style:square;mso-wrap-distance-left:9pt;mso-wrap-distance-top:0;mso-wrap-distance-right:9pt;mso-wrap-distance-bottom:0;mso-position-horizontal:absolute;mso-position-horizontal-relative:text;mso-position-vertical:absolute;mso-position-vertical-relative:text;v-text-anchor:middle" o:gfxdata="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" filled="f" strokecolor="red [3205]" strokeweight="3pt"/>
             </w:pict>
           </mc:Fallback>
         </mc:AlternateContent>
@@ -1317,13 +2167,11 @@
       <w:r>
         <w:rPr>
           <w:noProof/>
-          <w:sz w:val="24"/>
-          <w:szCs w:val="24"/>
         </w:rPr>
         <mc:AlternateContent>
           <mc:Choice Requires="wps">
             <w:drawing>
-              <wp:anchor distT="0" distB="0" distL="114300" distR="114300" simplePos="0" relativeHeight="251664384" behindDoc="0" locked="0" layoutInCell="1" allowOverlap="1" wp14:anchorId="6C427BD2" wp14:editId="4D95107D">
+              <wp:anchor distT="0" distB="0" distL="114300" distR="114300" simplePos="0" relativeHeight="251664384" behindDoc="0" locked="0" layoutInCell="1" allowOverlap="1" wp14:anchorId="6686EB45" wp14:editId="60FCA70F">
                 <wp:simplePos x="0" y="0"/>
                 <wp:positionH relativeFrom="column">
                   <wp:posOffset>5090795</wp:posOffset>
@@ -1382,14 +2230,9 @@
               </wp:anchor>
             </w:drawing>
           </mc:Choice>
-          <mc:Fallback xmlns:wpsCustomData="http://www.wps.cn/officeDocument/2013/wpsCustomData">
+          <mc:Fallback>
             <w:pict>
-              <v:shape id="Ovale 5" o:spid="_x0000_s1026" o:spt="3" type="#_x0000_t3" style="position:absolute;left:0pt;margin-left:400.85pt;margin-top:3.95pt;height:23.15pt;width:24.6pt;z-index:251664384;v-text-anchor:middle;mso-width-relative:page;mso-height-relative:page;" filled="f" stroked="t" coordsize="21600,21600" o:gfxdata="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">
-                <v:fill on="f" focussize="0,0"/>
-                <v:stroke weight="3pt" color="#FF0000 [3205]" joinstyle="round"/>
-                <v:imagedata o:title=""/>
-                <o:lock v:ext="edit" aspectratio="f"/>
-              </v:shape>
+              <v:oval w14:anchorId="08853CF2" id="Ovale 5" o:spid="_x0000_s1026" style="position:absolute;margin-left:400.85pt;margin-top:3.95pt;width:24.6pt;height:23.15pt;z-index:251664384;visibility:visible;mso-wrap-style:square;mso-wrap-distance-left:9pt;mso-wrap-distance-top:0;mso-wrap-distance-right:9pt;mso-wrap-distance-bottom:0;mso-position-horizontal:absolute;mso-position-horizontal-relative:text;mso-position-vertical:absolute;mso-position-vertical-relative:text;v-text-anchor:middle" o:gfxdata="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" filled="f" strokecolor="red [3205]" strokeweight="3pt"/>
             </w:pict>
           </mc:Fallback>
         </mc:AlternateContent>
@@ -1397,11 +2240,9 @@
       <w:r>
         <w:rPr>
           <w:noProof/>
-          <w:sz w:val="24"/>
-          <w:szCs w:val="24"/>
         </w:rPr>
         <w:drawing>
-          <wp:inline distT="0" distB="0" distL="0" distR="0" wp14:anchorId="6AA66625" wp14:editId="5A002644">
+          <wp:inline distT="0" distB="0" distL="0" distR="0" wp14:anchorId="57A1D7FE" wp14:editId="76E81A8A">
             <wp:extent cx="5372100" cy="1406622"/>
             <wp:effectExtent l="0" t="0" r="0" b="3175"/>
             <wp:docPr id="1548409420" name="Immagine 1" descr="Immagine che contiene testo, schermata, Carattere, numero&#10;&#10;Descrizione generata automaticamente"/>
@@ -1446,52 +2287,23 @@
           <w:ilvl w:val="0"/>
           <w:numId w:val="14"/>
         </w:numPr>
-        <w:rPr>
-          <w:sz w:val="24"/>
-          <w:szCs w:val="24"/>
-        </w:rPr>
       </w:pPr>
       <w:r>
-        <w:rPr>
-          <w:sz w:val="24"/>
-          <w:szCs w:val="24"/>
-        </w:rPr>
-        <w:t xml:space="preserve">Una volta terminato il download, cliccare sul file di setup appena scaricato, eseguirlo e seguire le istruzioni di installazione fornite dal </w:t>
-      </w:r>
-      <w:r>
-        <w:rPr>
-          <w:sz w:val="24"/>
-          <w:szCs w:val="24"/>
-        </w:rPr>
-        <w:t>software</w:t>
-      </w:r>
-      <w:r>
-        <w:rPr>
-          <w:sz w:val="24"/>
-          <w:szCs w:val="24"/>
-        </w:rPr>
-        <w:t>.</w:t>
+        <w:t>Una volta terminato il download, cliccare sul file di setup appena scaricato, eseguirlo e seguire le istruzioni di installazione fornite dal software.</w:t>
       </w:r>
     </w:p>
     <w:p>
       <w:pPr>
         <w:ind w:left="1080"/>
-        <w:rPr>
-          <w:sz w:val="24"/>
-          <w:szCs w:val="24"/>
-        </w:rPr>
       </w:pPr>
       <w:r>
         <w:rPr>
           <w:noProof/>
-          <w:sz w:val="24"/>
-          <w:szCs w:val="24"/>
         </w:rPr>
-        <w:lastRenderedPageBreak/>
         <mc:AlternateContent>
           <mc:Choice Requires="wps">
             <w:drawing>
-              <wp:anchor distT="0" distB="0" distL="114300" distR="114300" simplePos="0" relativeHeight="251665408" behindDoc="0" locked="0" layoutInCell="1" allowOverlap="1" wp14:anchorId="614742CF" wp14:editId="05DAF84A">
+              <wp:anchor distT="0" distB="0" distL="114300" distR="114300" simplePos="0" relativeHeight="251665408" behindDoc="0" locked="0" layoutInCell="1" allowOverlap="1" wp14:anchorId="414F1638" wp14:editId="12144660">
                 <wp:simplePos x="0" y="0"/>
                 <wp:positionH relativeFrom="column">
                   <wp:posOffset>4499610</wp:posOffset>
@@ -1541,13 +2353,10 @@
               </wp:anchor>
             </w:drawing>
           </mc:Choice>
-          <mc:Fallback xmlns:wpsCustomData="http://www.wps.cn/officeDocument/2013/wpsCustomData">
+          <mc:Fallback>
             <w:pict>
-              <v:shape id="Connettore 2 6" o:spid="_x0000_s1026" o:spt="32" type="#_x0000_t32" style="position:absolute;left:0pt;margin-left:354.3pt;margin-top:235.85pt;height:20.85pt;width:38.55pt;z-index:251665408;mso-width-relative:page;mso-height-relative:page;" filled="f" stroked="t" coordsize="21600,21600" o:gfxdata="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">
-                <v:fill on="f" focussize="0,0"/>
-                <v:stroke weight="4.5pt" color="#FF0000 [3205]" miterlimit="8" joinstyle="miter" endarrow="block"/>
-                <v:imagedata o:title=""/>
-                <o:lock v:ext="edit" aspectratio="f"/>
+              <v:shape w14:anchorId="15E13C50" id="Connettore 2 6" o:spid="_x0000_s1026" type="#_x0000_t32" style="position:absolute;margin-left:354.3pt;margin-top:235.85pt;width:38.55pt;height:20.85pt;z-index:251665408;visibility:visible;mso-wrap-style:square;mso-wrap-distance-left:9pt;mso-wrap-distance-top:0;mso-wrap-distance-right:9pt;mso-wrap-distance-bottom:0;mso-position-horizontal:absolute;mso-position-horizontal-relative:text;mso-position-vertical:absolute;mso-position-vertical-relative:text" o:gfxdata="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" strokecolor="red [3205]" strokeweight="4.5pt">
+                <v:stroke endarrow="block" joinstyle="miter"/>
               </v:shape>
             </w:pict>
           </mc:Fallback>
@@ -1556,11 +2365,9 @@
       <w:r>
         <w:rPr>
           <w:noProof/>
-          <w:sz w:val="24"/>
-          <w:szCs w:val="24"/>
         </w:rPr>
         <w:drawing>
-          <wp:inline distT="0" distB="0" distL="0" distR="0" wp14:anchorId="3C73D060" wp14:editId="0B897A4E">
+          <wp:inline distT="0" distB="0" distL="0" distR="0" wp14:anchorId="2EDC9729" wp14:editId="5F9FC1E8">
             <wp:extent cx="5417820" cy="2938794"/>
             <wp:effectExtent l="0" t="0" r="0" b="0"/>
             <wp:docPr id="566899895" name="Immagine 1" descr="Immagine che contiene testo, elettronica, schermata, Carattere&#10;&#10;Descrizione generata automaticamente"/>
@@ -1605,16 +2412,8 @@
           <w:ilvl w:val="0"/>
           <w:numId w:val="14"/>
         </w:numPr>
-        <w:rPr>
-          <w:sz w:val="24"/>
-          <w:szCs w:val="24"/>
-        </w:rPr>
       </w:pPr>
       <w:r>
-        <w:rPr>
-          <w:sz w:val="24"/>
-          <w:szCs w:val="24"/>
-        </w:rPr>
         <w:t>Terminata l’installazione, premere il tasto “Chiudi”.</w:t>
       </w:r>
     </w:p>
@@ -1625,32 +2424,18 @@
           <w:ilvl w:val="0"/>
           <w:numId w:val="14"/>
         </w:numPr>
-        <w:rPr>
-          <w:sz w:val="24"/>
-          <w:szCs w:val="24"/>
-        </w:rPr>
       </w:pPr>
       <w:r>
-        <w:rPr>
-          <w:sz w:val="24"/>
-          <w:szCs w:val="24"/>
-        </w:rPr>
         <w:t>Verificare la corretta installazione di Java nel vostro dispositivo come spiegato nel punto “</w:t>
       </w:r>
       <w:r>
         <w:rPr>
           <w:b/>
           <w:bCs/>
-          <w:sz w:val="24"/>
-          <w:szCs w:val="24"/>
         </w:rPr>
         <w:t>Verifica della presenza di Java nel proprio dispositivo</w:t>
       </w:r>
       <w:r>
-        <w:rPr>
-          <w:sz w:val="24"/>
-          <w:szCs w:val="24"/>
-        </w:rPr>
         <w:t>”.</w:t>
       </w:r>
     </w:p>
@@ -1677,10 +2462,19 @@
         <w:rPr>
           <w:b/>
           <w:bCs/>
-          <w:sz w:val="24"/>
-          <w:szCs w:val="24"/>
+          <w:sz w:val="28"/>
+          <w:szCs w:val="28"/>
         </w:rPr>
-        <w:t>2.2 Installazione del software</w:t>
+        <w:t>5</w:t>
+      </w:r>
+      <w:r>
+        <w:rPr>
+          <w:b/>
+          <w:bCs/>
+          <w:sz w:val="28"/>
+          <w:szCs w:val="28"/>
+        </w:rPr>
+        <w:t>.2 Installazione del software</w:t>
       </w:r>
     </w:p>
     <w:p>
@@ -1710,7 +2504,16 @@
         </w:numPr>
       </w:pPr>
       <w:r>
-        <w:t>Estrarre tutti i file dell’archivio nella directory che si preferisce con l’utilizzo di un qualsiasi software di estrazione file (i.e. comando di estrazione Windows, WinRar)</w:t>
+        <w:lastRenderedPageBreak/>
+        <w:t xml:space="preserve">Estrarre tutti i file dell’archivio nella directory che si preferisce con l’utilizzo di un qualsiasi software di estrazione file (i.e. comando di estrazione Windows, </w:t>
+      </w:r>
+      <w:proofErr w:type="spellStart"/>
+      <w:r>
+        <w:t>WinRar</w:t>
+      </w:r>
+      <w:proofErr w:type="spellEnd"/>
+      <w:r>
+        <w:t>)</w:t>
       </w:r>
       <w:r>
         <w:rPr>
@@ -1738,10 +2541,10 @@
           <w:noProof/>
         </w:rPr>
         <w:drawing>
-          <wp:inline distT="0" distB="0" distL="0" distR="0" wp14:anchorId="70063003" wp14:editId="40198490">
+          <wp:inline distT="0" distB="0" distL="0" distR="0" wp14:anchorId="0EDEBC19" wp14:editId="11E2C441">
             <wp:extent cx="5059680" cy="1546860"/>
             <wp:effectExtent l="0" t="0" r="7620" b="0"/>
-            <wp:docPr id="1708256306" name="Immagine 1"/>
+            <wp:docPr id="1708256306" name="Immagine 1" descr="Immagine che contiene testo, schermata, software, Software multimediale&#10;&#10;Descrizione generata automaticamente"/>
             <wp:cNvGraphicFramePr>
               <a:graphicFrameLocks xmlns:a="http://schemas.openxmlformats.org/drawingml/2006/main" noChangeAspect="1"/>
             </wp:cNvGraphicFramePr>
@@ -1749,7 +2552,7 @@
               <a:graphicData uri="http://schemas.openxmlformats.org/drawingml/2006/picture">
                 <pic:pic xmlns:pic="http://schemas.openxmlformats.org/drawingml/2006/picture">
                   <pic:nvPicPr>
-                    <pic:cNvPr id="0" name="Picture 1"/>
+                    <pic:cNvPr id="1708256306" name="Immagine 1" descr="Immagine che contiene testo, schermata, software, Software multimediale&#10;&#10;Descrizione generata automaticamente"/>
                     <pic:cNvPicPr>
                       <a:picLocks noChangeAspect="1" noChangeArrowheads="1"/>
                     </pic:cNvPicPr>
@@ -1807,7 +2610,7 @@
           <w:noProof/>
         </w:rPr>
         <w:drawing>
-          <wp:inline distT="0" distB="0" distL="0" distR="0" wp14:anchorId="683F4973" wp14:editId="0498A6B8">
+          <wp:inline distT="0" distB="0" distL="0" distR="0" wp14:anchorId="438FBBCB" wp14:editId="7C242DD7">
             <wp:extent cx="5036820" cy="1011861"/>
             <wp:effectExtent l="0" t="0" r="0" b="0"/>
             <wp:docPr id="1301706930" name="Immagine 1" descr="Immagine che contiene testo, schermata, Carattere, numero&#10;&#10;Descrizione generata automaticamente"/>
@@ -1851,10 +2654,31 @@
         </w:numPr>
       </w:pPr>
       <w:r>
-        <w:t>Aprire il prompt dei comandi premendo i tasti Win + R, digitando “cmd” e premendo “OK” (oppure cercando “cmd” nella barra di ricerca di Windows)</w:t>
+        <w:t xml:space="preserve">Aprire il prompt dei comandi premendo i tasti </w:t>
       </w:r>
+      <w:proofErr w:type="spellStart"/>
       <w:r>
-        <w:t>.</w:t>
+        <w:t>Win</w:t>
+      </w:r>
+      <w:proofErr w:type="spellEnd"/>
+      <w:r>
+        <w:t xml:space="preserve"> + R, digitando “</w:t>
+      </w:r>
+      <w:proofErr w:type="spellStart"/>
+      <w:r>
+        <w:t>cmd</w:t>
+      </w:r>
+      <w:proofErr w:type="spellEnd"/>
+      <w:r>
+        <w:t>” e premendo “OK” (oppure cercando “</w:t>
+      </w:r>
+      <w:proofErr w:type="spellStart"/>
+      <w:r>
+        <w:t>cmd</w:t>
+      </w:r>
+      <w:proofErr w:type="spellEnd"/>
+      <w:r>
+        <w:t>” nella barra di ricerca di Windows).</w:t>
       </w:r>
     </w:p>
     <w:p>
@@ -1869,9 +2693,8 @@
         <w:rPr>
           <w:noProof/>
         </w:rPr>
-        <w:lastRenderedPageBreak/>
         <w:drawing>
-          <wp:inline distT="0" distB="0" distL="0" distR="0" wp14:anchorId="0FEDA36C" wp14:editId="05949279">
+          <wp:inline distT="0" distB="0" distL="0" distR="0" wp14:anchorId="12FF7BCE" wp14:editId="6E3D5A7C">
             <wp:extent cx="3104254" cy="1851660"/>
             <wp:effectExtent l="0" t="0" r="1270" b="0"/>
             <wp:docPr id="1422567479" name="Immagine 1" descr="Immagine che contiene testo, schermata, schermo, Carattere&#10;&#10;Descrizione generata automaticamente"/>
@@ -1915,10 +2738,7 @@
         </w:numPr>
       </w:pPr>
       <w:r>
-        <w:t>P</w:t>
-      </w:r>
-      <w:r>
-        <w:t>osizionarsi</w:t>
+        <w:t>Posizionarsi</w:t>
       </w:r>
       <w:r>
         <w:t xml:space="preserve"> nella directory dove sono stati estratti i file con il </w:t>
@@ -1939,10 +2759,10 @@
           <w:noProof/>
         </w:rPr>
         <w:drawing>
-          <wp:inline distT="0" distB="0" distL="0" distR="0" wp14:anchorId="22B1C430" wp14:editId="3F98C43A">
+          <wp:inline distT="0" distB="0" distL="0" distR="0" wp14:anchorId="42C54048" wp14:editId="243FE01A">
             <wp:extent cx="4495800" cy="1150620"/>
             <wp:effectExtent l="0" t="0" r="0" b="0"/>
-            <wp:docPr id="259126527" name="Immagine 2"/>
+            <wp:docPr id="259126527" name="Immagine 2" descr="Immagine che contiene testo, schermata, Carattere&#10;&#10;Descrizione generata automaticamente"/>
             <wp:cNvGraphicFramePr>
               <a:graphicFrameLocks xmlns:a="http://schemas.openxmlformats.org/drawingml/2006/main" noChangeAspect="1"/>
             </wp:cNvGraphicFramePr>
@@ -1950,7 +2770,7 @@
               <a:graphicData uri="http://schemas.openxmlformats.org/drawingml/2006/picture">
                 <pic:pic xmlns:pic="http://schemas.openxmlformats.org/drawingml/2006/picture">
                   <pic:nvPicPr>
-                    <pic:cNvPr id="0" name="Picture 2"/>
+                    <pic:cNvPr id="259126527" name="Immagine 2" descr="Immagine che contiene testo, schermata, Carattere&#10;&#10;Descrizione generata automaticamente"/>
                     <pic:cNvPicPr>
                       <a:picLocks noChangeAspect="1" noChangeArrowheads="1"/>
                     </pic:cNvPicPr>
@@ -1996,17 +2816,25 @@
         </w:numPr>
       </w:pPr>
       <w:r>
-        <w:t>Eseguire il programma tramite il comando “java -jar WebMiningProject.jar [argomenti]”.</w:t>
+        <w:t>Eseguire il programma tramite il comando “java -</w:t>
+      </w:r>
+      <w:proofErr w:type="spellStart"/>
+      <w:r>
+        <w:t>jar</w:t>
+      </w:r>
+      <w:proofErr w:type="spellEnd"/>
+      <w:r>
+        <w:t xml:space="preserve"> WebMiningProject.jar [argomenti]”.</w:t>
       </w:r>
       <w:r>
         <w:rPr>
           <w:noProof/>
         </w:rPr>
         <w:drawing>
-          <wp:inline distT="0" distB="0" distL="0" distR="0" wp14:anchorId="7FE31980" wp14:editId="5B6CB0CF">
+          <wp:inline distT="0" distB="0" distL="0" distR="0" wp14:anchorId="41850609" wp14:editId="274550C7">
             <wp:extent cx="5509260" cy="1118279"/>
             <wp:effectExtent l="0" t="0" r="0" b="5715"/>
-            <wp:docPr id="986293725" name="Immagine 3"/>
+            <wp:docPr id="986293725" name="Immagine 3" descr="Immagine che contiene testo, Carattere, software, schermata&#10;&#10;Descrizione generata automaticamente"/>
             <wp:cNvGraphicFramePr>
               <a:graphicFrameLocks xmlns:a="http://schemas.openxmlformats.org/drawingml/2006/main" noChangeAspect="1"/>
             </wp:cNvGraphicFramePr>
@@ -2014,7 +2842,7 @@
               <a:graphicData uri="http://schemas.openxmlformats.org/drawingml/2006/picture">
                 <pic:pic xmlns:pic="http://schemas.openxmlformats.org/drawingml/2006/picture">
                   <pic:nvPicPr>
-                    <pic:cNvPr id="0" name="Picture 3"/>
+                    <pic:cNvPr id="986293725" name="Immagine 3" descr="Immagine che contiene testo, Carattere, software, schermata&#10;&#10;Descrizione generata automaticamente"/>
                     <pic:cNvPicPr>
                       <a:picLocks noChangeAspect="1" noChangeArrowheads="1"/>
                     </pic:cNvPicPr>
@@ -2050,264 +2878,6 @@
             </a:graphic>
           </wp:inline>
         </w:drawing>
-      </w:r>
-    </w:p>
-    <w:p/>
-    <w:p>
-      <w:pPr>
-        <w:rPr>
-          <w:b/>
-          <w:bCs/>
-          <w:sz w:val="32"/>
-          <w:szCs w:val="32"/>
-        </w:rPr>
-      </w:pPr>
-      <w:r>
-        <w:rPr>
-          <w:b/>
-          <w:bCs/>
-          <w:sz w:val="32"/>
-          <w:szCs w:val="32"/>
-        </w:rPr>
-        <w:t>3. Finalità del software</w:t>
-      </w:r>
-    </w:p>
-    <w:p>
-      <w:r>
-        <w:t>L'applicazione offre la possibilità di scaricare e archiviare comodamente e in maniera locale fino a 2000 articoli. Ciò include 1000 articoli provenienti da file CSV e 1000 articoli ottenuti tramite richieste all'API del The Guardian. Per effettuare queste richieste, è necessario utilizzare una chiave API personale e il programma leggerà e scriverà i dati in un file JSON.</w:t>
-      </w:r>
-    </w:p>
-    <w:p>
-      <w:r>
-        <w:t>Il programma è, inoltre, capace di estrarre e visualizzare i termini più “importanti” per ordine di peso nell’insieme degli articoli scaricati.</w:t>
-      </w:r>
-    </w:p>
-    <w:p/>
-    <w:p>
-      <w:pPr>
-        <w:rPr>
-          <w:b/>
-          <w:bCs/>
-          <w:sz w:val="32"/>
-          <w:szCs w:val="32"/>
-        </w:rPr>
-      </w:pPr>
-      <w:r>
-        <w:rPr>
-          <w:b/>
-          <w:bCs/>
-          <w:sz w:val="32"/>
-          <w:szCs w:val="32"/>
-        </w:rPr>
-        <w:t>4. Funzionalità</w:t>
-      </w:r>
-    </w:p>
-    <w:p>
-      <w:pPr>
-        <w:numPr>
-          <w:ilvl w:val="0"/>
-          <w:numId w:val="16"/>
-        </w:numPr>
-        <w:rPr>
-          <w:b/>
-          <w:bCs/>
-        </w:rPr>
-      </w:pPr>
-      <w:r>
-        <w:rPr>
-          <w:b/>
-          <w:bCs/>
-        </w:rPr>
-        <w:t>Download</w:t>
-      </w:r>
-      <w:r>
-        <w:rPr>
-          <w:b/>
-          <w:bCs/>
-        </w:rPr>
-        <w:t xml:space="preserve"> di articoli dall’API The Guardian</w:t>
-      </w:r>
-    </w:p>
-    <w:p>
-      <w:pPr>
-        <w:numPr>
-          <w:ilvl w:val="0"/>
-          <w:numId w:val="16"/>
-        </w:numPr>
-        <w:rPr>
-          <w:b/>
-          <w:bCs/>
-        </w:rPr>
-      </w:pPr>
-      <w:r>
-        <w:rPr>
-          <w:b/>
-          <w:bCs/>
-        </w:rPr>
-        <w:t>Lettura di articoli da file CSV</w:t>
-      </w:r>
-    </w:p>
-    <w:p>
-      <w:pPr>
-        <w:numPr>
-          <w:ilvl w:val="0"/>
-          <w:numId w:val="16"/>
-        </w:numPr>
-      </w:pPr>
-      <w:r>
-        <w:rPr>
-          <w:b/>
-          <w:bCs/>
-        </w:rPr>
-        <w:t xml:space="preserve">Serializzazione degli articoli letti </w:t>
-      </w:r>
-    </w:p>
-    <w:p>
-      <w:pPr>
-        <w:numPr>
-          <w:ilvl w:val="0"/>
-          <w:numId w:val="16"/>
-        </w:numPr>
-      </w:pPr>
-      <w:r>
-        <w:rPr>
-          <w:b/>
-          <w:bCs/>
-        </w:rPr>
-        <w:t>Estrazione del peso dei termini che compaiono negli articoli</w:t>
-      </w:r>
-    </w:p>
-    <w:p>
-      <w:pPr>
-        <w:numPr>
-          <w:ilvl w:val="0"/>
-          <w:numId w:val="16"/>
-        </w:numPr>
-      </w:pPr>
-      <w:r>
-        <w:rPr>
-          <w:b/>
-          <w:bCs/>
-        </w:rPr>
-        <w:lastRenderedPageBreak/>
-        <w:t>Salvataggio su file dei termini più rilevanti</w:t>
-      </w:r>
-    </w:p>
-    <w:p>
-      <w:pPr>
-        <w:numPr>
-          <w:ilvl w:val="0"/>
-          <w:numId w:val="16"/>
-        </w:numPr>
-        <w:rPr>
-          <w:b/>
-          <w:bCs/>
-        </w:rPr>
-      </w:pPr>
-      <w:r>
-        <w:rPr>
-          <w:b/>
-          <w:bCs/>
-        </w:rPr>
-        <w:t>Visualizzazione di un menù di aiuto</w:t>
-      </w:r>
-    </w:p>
-    <w:p>
-      <w:pPr>
-        <w:rPr>
-          <w:u w:val="single"/>
-        </w:rPr>
-      </w:pPr>
-    </w:p>
-    <w:p>
-      <w:pPr>
-        <w:rPr>
-          <w:b/>
-          <w:bCs/>
-          <w:sz w:val="32"/>
-          <w:szCs w:val="32"/>
-        </w:rPr>
-      </w:pPr>
-      <w:r>
-        <w:rPr>
-          <w:b/>
-          <w:bCs/>
-          <w:sz w:val="32"/>
-          <w:szCs w:val="32"/>
-        </w:rPr>
-        <w:t>5. Librerie utilizzate</w:t>
-      </w:r>
-    </w:p>
-    <w:p>
-      <w:pPr>
-        <w:numPr>
-          <w:ilvl w:val="0"/>
-          <w:numId w:val="16"/>
-        </w:numPr>
-      </w:pPr>
-      <w:r>
-        <w:rPr>
-          <w:b/>
-          <w:bCs/>
-        </w:rPr>
-        <w:t>Apache Commons CLI</w:t>
-      </w:r>
-    </w:p>
-    <w:p>
-      <w:pPr>
-        <w:numPr>
-          <w:ilvl w:val="0"/>
-          <w:numId w:val="16"/>
-        </w:numPr>
-        <w:rPr>
-          <w:b/>
-          <w:bCs/>
-        </w:rPr>
-      </w:pPr>
-      <w:r>
-        <w:rPr>
-          <w:b/>
-          <w:bCs/>
-        </w:rPr>
-        <w:t>Gson</w:t>
-      </w:r>
-    </w:p>
-    <w:p>
-      <w:pPr>
-        <w:numPr>
-          <w:ilvl w:val="0"/>
-          <w:numId w:val="16"/>
-        </w:numPr>
-        <w:rPr>
-          <w:b/>
-          <w:bCs/>
-        </w:rPr>
-      </w:pPr>
-      <w:r>
-        <w:rPr>
-          <w:b/>
-          <w:bCs/>
-        </w:rPr>
-        <w:t>Apache Commons CSV</w:t>
-      </w:r>
-    </w:p>
-    <w:p>
-      <w:pPr>
-        <w:numPr>
-          <w:ilvl w:val="0"/>
-          <w:numId w:val="16"/>
-        </w:numPr>
-        <w:rPr>
-          <w:b/>
-          <w:bCs/>
-        </w:rPr>
-      </w:pPr>
-      <w:r>
-        <w:rPr>
-          <w:b/>
-          <w:bCs/>
-        </w:rPr>
-        <w:t>Cagate assortite client del Guardian</w:t>
       </w:r>
     </w:p>
     <w:sectPr>
@@ -2723,6 +3293,232 @@
     </w:lvl>
   </w:abstractNum>
   <w:abstractNum w:abstractNumId="11" w15:restartNumberingAfterBreak="0">
+    <w:nsid w:val="02693447"/>
+    <w:multiLevelType w:val="multilevel"/>
+    <w:tmpl w:val="6A9C7EB6"/>
+    <w:lvl w:ilvl="0">
+      <w:start w:val="1"/>
+      <w:numFmt w:val="bullet"/>
+      <w:lvlText w:val=""/>
+      <w:lvlJc w:val="left"/>
+      <w:pPr>
+        <w:ind w:left="720" w:hanging="360"/>
+      </w:pPr>
+      <w:rPr>
+        <w:rFonts w:ascii="Wingdings" w:hAnsi="Wingdings" w:hint="default"/>
+      </w:rPr>
+    </w:lvl>
+    <w:lvl w:ilvl="1">
+      <w:start w:val="1"/>
+      <w:numFmt w:val="bullet"/>
+      <w:lvlText w:val="o"/>
+      <w:lvlJc w:val="left"/>
+      <w:pPr>
+        <w:ind w:left="1440" w:hanging="360"/>
+      </w:pPr>
+      <w:rPr>
+        <w:rFonts w:ascii="Courier New" w:hAnsi="Courier New" w:cs="Courier New" w:hint="default"/>
+      </w:rPr>
+    </w:lvl>
+    <w:lvl w:ilvl="2">
+      <w:start w:val="1"/>
+      <w:numFmt w:val="bullet"/>
+      <w:lvlText w:val=""/>
+      <w:lvlJc w:val="left"/>
+      <w:pPr>
+        <w:ind w:left="2160" w:hanging="360"/>
+      </w:pPr>
+      <w:rPr>
+        <w:rFonts w:ascii="Wingdings" w:hAnsi="Wingdings" w:hint="default"/>
+      </w:rPr>
+    </w:lvl>
+    <w:lvl w:ilvl="3">
+      <w:start w:val="1"/>
+      <w:numFmt w:val="bullet"/>
+      <w:lvlText w:val=""/>
+      <w:lvlJc w:val="left"/>
+      <w:pPr>
+        <w:ind w:left="2880" w:hanging="360"/>
+      </w:pPr>
+      <w:rPr>
+        <w:rFonts w:ascii="Symbol" w:hAnsi="Symbol" w:hint="default"/>
+      </w:rPr>
+    </w:lvl>
+    <w:lvl w:ilvl="4">
+      <w:start w:val="1"/>
+      <w:numFmt w:val="bullet"/>
+      <w:lvlText w:val="o"/>
+      <w:lvlJc w:val="left"/>
+      <w:pPr>
+        <w:ind w:left="3600" w:hanging="360"/>
+      </w:pPr>
+      <w:rPr>
+        <w:rFonts w:ascii="Courier New" w:hAnsi="Courier New" w:cs="Courier New" w:hint="default"/>
+      </w:rPr>
+    </w:lvl>
+    <w:lvl w:ilvl="5">
+      <w:start w:val="1"/>
+      <w:numFmt w:val="bullet"/>
+      <w:lvlText w:val=""/>
+      <w:lvlJc w:val="left"/>
+      <w:pPr>
+        <w:ind w:left="4320" w:hanging="360"/>
+      </w:pPr>
+      <w:rPr>
+        <w:rFonts w:ascii="Wingdings" w:hAnsi="Wingdings" w:hint="default"/>
+      </w:rPr>
+    </w:lvl>
+    <w:lvl w:ilvl="6">
+      <w:start w:val="1"/>
+      <w:numFmt w:val="bullet"/>
+      <w:lvlText w:val=""/>
+      <w:lvlJc w:val="left"/>
+      <w:pPr>
+        <w:ind w:left="5040" w:hanging="360"/>
+      </w:pPr>
+      <w:rPr>
+        <w:rFonts w:ascii="Symbol" w:hAnsi="Symbol" w:hint="default"/>
+      </w:rPr>
+    </w:lvl>
+    <w:lvl w:ilvl="7">
+      <w:start w:val="1"/>
+      <w:numFmt w:val="bullet"/>
+      <w:lvlText w:val="o"/>
+      <w:lvlJc w:val="left"/>
+      <w:pPr>
+        <w:ind w:left="5760" w:hanging="360"/>
+      </w:pPr>
+      <w:rPr>
+        <w:rFonts w:ascii="Courier New" w:hAnsi="Courier New" w:cs="Courier New" w:hint="default"/>
+      </w:rPr>
+    </w:lvl>
+    <w:lvl w:ilvl="8">
+      <w:start w:val="1"/>
+      <w:numFmt w:val="bullet"/>
+      <w:lvlText w:val=""/>
+      <w:lvlJc w:val="left"/>
+      <w:pPr>
+        <w:ind w:left="6480" w:hanging="360"/>
+      </w:pPr>
+      <w:rPr>
+        <w:rFonts w:ascii="Wingdings" w:hAnsi="Wingdings" w:hint="default"/>
+      </w:rPr>
+    </w:lvl>
+  </w:abstractNum>
+  <w:abstractNum w:abstractNumId="12" w15:restartNumberingAfterBreak="0">
+    <w:nsid w:val="17802E4F"/>
+    <w:multiLevelType w:val="multilevel"/>
+    <w:tmpl w:val="0F048188"/>
+    <w:lvl w:ilvl="0">
+      <w:start w:val="1"/>
+      <w:numFmt w:val="bullet"/>
+      <w:lvlText w:val=""/>
+      <w:lvlJc w:val="left"/>
+      <w:pPr>
+        <w:ind w:left="720" w:hanging="360"/>
+      </w:pPr>
+      <w:rPr>
+        <w:rFonts w:ascii="Wingdings" w:hAnsi="Wingdings" w:hint="default"/>
+      </w:rPr>
+    </w:lvl>
+    <w:lvl w:ilvl="1">
+      <w:start w:val="1"/>
+      <w:numFmt w:val="bullet"/>
+      <w:lvlText w:val="o"/>
+      <w:lvlJc w:val="left"/>
+      <w:pPr>
+        <w:ind w:left="1440" w:hanging="360"/>
+      </w:pPr>
+      <w:rPr>
+        <w:rFonts w:ascii="Courier New" w:hAnsi="Courier New" w:cs="Courier New" w:hint="default"/>
+      </w:rPr>
+    </w:lvl>
+    <w:lvl w:ilvl="2">
+      <w:start w:val="1"/>
+      <w:numFmt w:val="bullet"/>
+      <w:lvlText w:val=""/>
+      <w:lvlJc w:val="left"/>
+      <w:pPr>
+        <w:ind w:left="2160" w:hanging="360"/>
+      </w:pPr>
+      <w:rPr>
+        <w:rFonts w:ascii="Wingdings" w:hAnsi="Wingdings" w:hint="default"/>
+      </w:rPr>
+    </w:lvl>
+    <w:lvl w:ilvl="3">
+      <w:start w:val="1"/>
+      <w:numFmt w:val="bullet"/>
+      <w:lvlText w:val=""/>
+      <w:lvlJc w:val="left"/>
+      <w:pPr>
+        <w:ind w:left="2880" w:hanging="360"/>
+      </w:pPr>
+      <w:rPr>
+        <w:rFonts w:ascii="Symbol" w:hAnsi="Symbol" w:hint="default"/>
+      </w:rPr>
+    </w:lvl>
+    <w:lvl w:ilvl="4">
+      <w:start w:val="1"/>
+      <w:numFmt w:val="bullet"/>
+      <w:lvlText w:val="o"/>
+      <w:lvlJc w:val="left"/>
+      <w:pPr>
+        <w:ind w:left="3600" w:hanging="360"/>
+      </w:pPr>
+      <w:rPr>
+        <w:rFonts w:ascii="Courier New" w:hAnsi="Courier New" w:cs="Courier New" w:hint="default"/>
+      </w:rPr>
+    </w:lvl>
+    <w:lvl w:ilvl="5">
+      <w:start w:val="1"/>
+      <w:numFmt w:val="bullet"/>
+      <w:lvlText w:val=""/>
+      <w:lvlJc w:val="left"/>
+      <w:pPr>
+        <w:ind w:left="4320" w:hanging="360"/>
+      </w:pPr>
+      <w:rPr>
+        <w:rFonts w:ascii="Wingdings" w:hAnsi="Wingdings" w:hint="default"/>
+      </w:rPr>
+    </w:lvl>
+    <w:lvl w:ilvl="6">
+      <w:start w:val="1"/>
+      <w:numFmt w:val="bullet"/>
+      <w:lvlText w:val=""/>
+      <w:lvlJc w:val="left"/>
+      <w:pPr>
+        <w:ind w:left="5040" w:hanging="360"/>
+      </w:pPr>
+      <w:rPr>
+        <w:rFonts w:ascii="Symbol" w:hAnsi="Symbol" w:hint="default"/>
+      </w:rPr>
+    </w:lvl>
+    <w:lvl w:ilvl="7">
+      <w:start w:val="1"/>
+      <w:numFmt w:val="bullet"/>
+      <w:lvlText w:val="o"/>
+      <w:lvlJc w:val="left"/>
+      <w:pPr>
+        <w:ind w:left="5760" w:hanging="360"/>
+      </w:pPr>
+      <w:rPr>
+        <w:rFonts w:ascii="Courier New" w:hAnsi="Courier New" w:cs="Courier New" w:hint="default"/>
+      </w:rPr>
+    </w:lvl>
+    <w:lvl w:ilvl="8">
+      <w:start w:val="1"/>
+      <w:numFmt w:val="bullet"/>
+      <w:lvlText w:val=""/>
+      <w:lvlJc w:val="left"/>
+      <w:pPr>
+        <w:ind w:left="6480" w:hanging="360"/>
+      </w:pPr>
+      <w:rPr>
+        <w:rFonts w:ascii="Wingdings" w:hAnsi="Wingdings" w:hint="default"/>
+      </w:rPr>
+    </w:lvl>
+  </w:abstractNum>
+  <w:abstractNum w:abstractNumId="13" w15:restartNumberingAfterBreak="0">
     <w:nsid w:val="345D045E"/>
     <w:multiLevelType w:val="multilevel"/>
     <w:tmpl w:val="345D045E"/>
@@ -2835,7 +3631,96 @@
       </w:rPr>
     </w:lvl>
   </w:abstractNum>
-  <w:abstractNum w:abstractNumId="12" w15:restartNumberingAfterBreak="0">
+  <w:abstractNum w:abstractNumId="14" w15:restartNumberingAfterBreak="0">
+    <w:nsid w:val="4097197A"/>
+    <w:multiLevelType w:val="hybridMultilevel"/>
+    <w:tmpl w:val="B142E372"/>
+    <w:lvl w:ilvl="0" w:tplc="0410000F">
+      <w:start w:val="4"/>
+      <w:numFmt w:val="decimal"/>
+      <w:lvlText w:val="%1."/>
+      <w:lvlJc w:val="left"/>
+      <w:pPr>
+        <w:ind w:left="720" w:hanging="360"/>
+      </w:pPr>
+      <w:rPr>
+        <w:rFonts w:hint="default"/>
+      </w:rPr>
+    </w:lvl>
+    <w:lvl w:ilvl="1" w:tplc="04100019" w:tentative="1">
+      <w:start w:val="1"/>
+      <w:numFmt w:val="lowerLetter"/>
+      <w:lvlText w:val="%2."/>
+      <w:lvlJc w:val="left"/>
+      <w:pPr>
+        <w:ind w:left="1440" w:hanging="360"/>
+      </w:pPr>
+    </w:lvl>
+    <w:lvl w:ilvl="2" w:tplc="0410001B" w:tentative="1">
+      <w:start w:val="1"/>
+      <w:numFmt w:val="lowerRoman"/>
+      <w:lvlText w:val="%3."/>
+      <w:lvlJc w:val="right"/>
+      <w:pPr>
+        <w:ind w:left="2160" w:hanging="180"/>
+      </w:pPr>
+    </w:lvl>
+    <w:lvl w:ilvl="3" w:tplc="0410000F" w:tentative="1">
+      <w:start w:val="1"/>
+      <w:numFmt w:val="decimal"/>
+      <w:lvlText w:val="%4."/>
+      <w:lvlJc w:val="left"/>
+      <w:pPr>
+        <w:ind w:left="2880" w:hanging="360"/>
+      </w:pPr>
+    </w:lvl>
+    <w:lvl w:ilvl="4" w:tplc="04100019" w:tentative="1">
+      <w:start w:val="1"/>
+      <w:numFmt w:val="lowerLetter"/>
+      <w:lvlText w:val="%5."/>
+      <w:lvlJc w:val="left"/>
+      <w:pPr>
+        <w:ind w:left="3600" w:hanging="360"/>
+      </w:pPr>
+    </w:lvl>
+    <w:lvl w:ilvl="5" w:tplc="0410001B" w:tentative="1">
+      <w:start w:val="1"/>
+      <w:numFmt w:val="lowerRoman"/>
+      <w:lvlText w:val="%6."/>
+      <w:lvlJc w:val="right"/>
+      <w:pPr>
+        <w:ind w:left="4320" w:hanging="180"/>
+      </w:pPr>
+    </w:lvl>
+    <w:lvl w:ilvl="6" w:tplc="0410000F" w:tentative="1">
+      <w:start w:val="1"/>
+      <w:numFmt w:val="decimal"/>
+      <w:lvlText w:val="%7."/>
+      <w:lvlJc w:val="left"/>
+      <w:pPr>
+        <w:ind w:left="5040" w:hanging="360"/>
+      </w:pPr>
+    </w:lvl>
+    <w:lvl w:ilvl="7" w:tplc="04100019" w:tentative="1">
+      <w:start w:val="1"/>
+      <w:numFmt w:val="lowerLetter"/>
+      <w:lvlText w:val="%8."/>
+      <w:lvlJc w:val="left"/>
+      <w:pPr>
+        <w:ind w:left="5760" w:hanging="360"/>
+      </w:pPr>
+    </w:lvl>
+    <w:lvl w:ilvl="8" w:tplc="0410001B" w:tentative="1">
+      <w:start w:val="1"/>
+      <w:numFmt w:val="lowerRoman"/>
+      <w:lvlText w:val="%9."/>
+      <w:lvlJc w:val="right"/>
+      <w:pPr>
+        <w:ind w:left="6480" w:hanging="180"/>
+      </w:pPr>
+    </w:lvl>
+  </w:abstractNum>
+  <w:abstractNum w:abstractNumId="15" w15:restartNumberingAfterBreak="0">
     <w:nsid w:val="42EFB6FB"/>
     <w:multiLevelType w:val="singleLevel"/>
     <w:tmpl w:val="42EFB6FB"/>
@@ -2847,7 +3732,233 @@
       <w:lvlJc w:val="left"/>
     </w:lvl>
   </w:abstractNum>
-  <w:abstractNum w:abstractNumId="13" w15:restartNumberingAfterBreak="0">
+  <w:abstractNum w:abstractNumId="16" w15:restartNumberingAfterBreak="0">
+    <w:nsid w:val="59293FF3"/>
+    <w:multiLevelType w:val="multilevel"/>
+    <w:tmpl w:val="5EE878A2"/>
+    <w:lvl w:ilvl="0">
+      <w:start w:val="1"/>
+      <w:numFmt w:val="bullet"/>
+      <w:lvlText w:val=""/>
+      <w:lvlJc w:val="left"/>
+      <w:pPr>
+        <w:ind w:left="720" w:hanging="360"/>
+      </w:pPr>
+      <w:rPr>
+        <w:rFonts w:ascii="Wingdings" w:hAnsi="Wingdings" w:hint="default"/>
+      </w:rPr>
+    </w:lvl>
+    <w:lvl w:ilvl="1">
+      <w:start w:val="1"/>
+      <w:numFmt w:val="bullet"/>
+      <w:lvlText w:val="o"/>
+      <w:lvlJc w:val="left"/>
+      <w:pPr>
+        <w:ind w:left="1440" w:hanging="360"/>
+      </w:pPr>
+      <w:rPr>
+        <w:rFonts w:ascii="Courier New" w:hAnsi="Courier New" w:cs="Courier New" w:hint="default"/>
+      </w:rPr>
+    </w:lvl>
+    <w:lvl w:ilvl="2">
+      <w:start w:val="1"/>
+      <w:numFmt w:val="bullet"/>
+      <w:lvlText w:val=""/>
+      <w:lvlJc w:val="left"/>
+      <w:pPr>
+        <w:ind w:left="2160" w:hanging="360"/>
+      </w:pPr>
+      <w:rPr>
+        <w:rFonts w:ascii="Wingdings" w:hAnsi="Wingdings" w:hint="default"/>
+      </w:rPr>
+    </w:lvl>
+    <w:lvl w:ilvl="3">
+      <w:start w:val="1"/>
+      <w:numFmt w:val="bullet"/>
+      <w:lvlText w:val=""/>
+      <w:lvlJc w:val="left"/>
+      <w:pPr>
+        <w:ind w:left="2880" w:hanging="360"/>
+      </w:pPr>
+      <w:rPr>
+        <w:rFonts w:ascii="Symbol" w:hAnsi="Symbol" w:hint="default"/>
+      </w:rPr>
+    </w:lvl>
+    <w:lvl w:ilvl="4">
+      <w:start w:val="1"/>
+      <w:numFmt w:val="bullet"/>
+      <w:lvlText w:val="o"/>
+      <w:lvlJc w:val="left"/>
+      <w:pPr>
+        <w:ind w:left="3600" w:hanging="360"/>
+      </w:pPr>
+      <w:rPr>
+        <w:rFonts w:ascii="Courier New" w:hAnsi="Courier New" w:cs="Courier New" w:hint="default"/>
+      </w:rPr>
+    </w:lvl>
+    <w:lvl w:ilvl="5">
+      <w:start w:val="1"/>
+      <w:numFmt w:val="bullet"/>
+      <w:lvlText w:val=""/>
+      <w:lvlJc w:val="left"/>
+      <w:pPr>
+        <w:ind w:left="4320" w:hanging="360"/>
+      </w:pPr>
+      <w:rPr>
+        <w:rFonts w:ascii="Wingdings" w:hAnsi="Wingdings" w:hint="default"/>
+      </w:rPr>
+    </w:lvl>
+    <w:lvl w:ilvl="6">
+      <w:start w:val="1"/>
+      <w:numFmt w:val="bullet"/>
+      <w:lvlText w:val=""/>
+      <w:lvlJc w:val="left"/>
+      <w:pPr>
+        <w:ind w:left="5040" w:hanging="360"/>
+      </w:pPr>
+      <w:rPr>
+        <w:rFonts w:ascii="Symbol" w:hAnsi="Symbol" w:hint="default"/>
+      </w:rPr>
+    </w:lvl>
+    <w:lvl w:ilvl="7">
+      <w:start w:val="1"/>
+      <w:numFmt w:val="bullet"/>
+      <w:lvlText w:val="o"/>
+      <w:lvlJc w:val="left"/>
+      <w:pPr>
+        <w:ind w:left="5760" w:hanging="360"/>
+      </w:pPr>
+      <w:rPr>
+        <w:rFonts w:ascii="Courier New" w:hAnsi="Courier New" w:cs="Courier New" w:hint="default"/>
+      </w:rPr>
+    </w:lvl>
+    <w:lvl w:ilvl="8">
+      <w:start w:val="1"/>
+      <w:numFmt w:val="bullet"/>
+      <w:lvlText w:val=""/>
+      <w:lvlJc w:val="left"/>
+      <w:pPr>
+        <w:ind w:left="6480" w:hanging="360"/>
+      </w:pPr>
+      <w:rPr>
+        <w:rFonts w:ascii="Wingdings" w:hAnsi="Wingdings" w:hint="default"/>
+      </w:rPr>
+    </w:lvl>
+  </w:abstractNum>
+  <w:abstractNum w:abstractNumId="17" w15:restartNumberingAfterBreak="0">
+    <w:nsid w:val="5EC2006F"/>
+    <w:multiLevelType w:val="hybridMultilevel"/>
+    <w:tmpl w:val="BB14A0EA"/>
+    <w:lvl w:ilvl="0" w:tplc="04100001">
+      <w:start w:val="1"/>
+      <w:numFmt w:val="bullet"/>
+      <w:lvlText w:val=""/>
+      <w:lvlJc w:val="left"/>
+      <w:pPr>
+        <w:ind w:left="1440" w:hanging="360"/>
+      </w:pPr>
+      <w:rPr>
+        <w:rFonts w:ascii="Symbol" w:hAnsi="Symbol" w:hint="default"/>
+      </w:rPr>
+    </w:lvl>
+    <w:lvl w:ilvl="1" w:tplc="04100003" w:tentative="1">
+      <w:start w:val="1"/>
+      <w:numFmt w:val="bullet"/>
+      <w:lvlText w:val="o"/>
+      <w:lvlJc w:val="left"/>
+      <w:pPr>
+        <w:ind w:left="2160" w:hanging="360"/>
+      </w:pPr>
+      <w:rPr>
+        <w:rFonts w:ascii="Courier New" w:hAnsi="Courier New" w:cs="Courier New" w:hint="default"/>
+      </w:rPr>
+    </w:lvl>
+    <w:lvl w:ilvl="2" w:tplc="04100005" w:tentative="1">
+      <w:start w:val="1"/>
+      <w:numFmt w:val="bullet"/>
+      <w:lvlText w:val=""/>
+      <w:lvlJc w:val="left"/>
+      <w:pPr>
+        <w:ind w:left="2880" w:hanging="360"/>
+      </w:pPr>
+      <w:rPr>
+        <w:rFonts w:ascii="Wingdings" w:hAnsi="Wingdings" w:hint="default"/>
+      </w:rPr>
+    </w:lvl>
+    <w:lvl w:ilvl="3" w:tplc="04100001" w:tentative="1">
+      <w:start w:val="1"/>
+      <w:numFmt w:val="bullet"/>
+      <w:lvlText w:val=""/>
+      <w:lvlJc w:val="left"/>
+      <w:pPr>
+        <w:ind w:left="3600" w:hanging="360"/>
+      </w:pPr>
+      <w:rPr>
+        <w:rFonts w:ascii="Symbol" w:hAnsi="Symbol" w:hint="default"/>
+      </w:rPr>
+    </w:lvl>
+    <w:lvl w:ilvl="4" w:tplc="04100003" w:tentative="1">
+      <w:start w:val="1"/>
+      <w:numFmt w:val="bullet"/>
+      <w:lvlText w:val="o"/>
+      <w:lvlJc w:val="left"/>
+      <w:pPr>
+        <w:ind w:left="4320" w:hanging="360"/>
+      </w:pPr>
+      <w:rPr>
+        <w:rFonts w:ascii="Courier New" w:hAnsi="Courier New" w:cs="Courier New" w:hint="default"/>
+      </w:rPr>
+    </w:lvl>
+    <w:lvl w:ilvl="5" w:tplc="04100005" w:tentative="1">
+      <w:start w:val="1"/>
+      <w:numFmt w:val="bullet"/>
+      <w:lvlText w:val=""/>
+      <w:lvlJc w:val="left"/>
+      <w:pPr>
+        <w:ind w:left="5040" w:hanging="360"/>
+      </w:pPr>
+      <w:rPr>
+        <w:rFonts w:ascii="Wingdings" w:hAnsi="Wingdings" w:hint="default"/>
+      </w:rPr>
+    </w:lvl>
+    <w:lvl w:ilvl="6" w:tplc="04100001" w:tentative="1">
+      <w:start w:val="1"/>
+      <w:numFmt w:val="bullet"/>
+      <w:lvlText w:val=""/>
+      <w:lvlJc w:val="left"/>
+      <w:pPr>
+        <w:ind w:left="5760" w:hanging="360"/>
+      </w:pPr>
+      <w:rPr>
+        <w:rFonts w:ascii="Symbol" w:hAnsi="Symbol" w:hint="default"/>
+      </w:rPr>
+    </w:lvl>
+    <w:lvl w:ilvl="7" w:tplc="04100003" w:tentative="1">
+      <w:start w:val="1"/>
+      <w:numFmt w:val="bullet"/>
+      <w:lvlText w:val="o"/>
+      <w:lvlJc w:val="left"/>
+      <w:pPr>
+        <w:ind w:left="6480" w:hanging="360"/>
+      </w:pPr>
+      <w:rPr>
+        <w:rFonts w:ascii="Courier New" w:hAnsi="Courier New" w:cs="Courier New" w:hint="default"/>
+      </w:rPr>
+    </w:lvl>
+    <w:lvl w:ilvl="8" w:tplc="04100005" w:tentative="1">
+      <w:start w:val="1"/>
+      <w:numFmt w:val="bullet"/>
+      <w:lvlText w:val=""/>
+      <w:lvlJc w:val="left"/>
+      <w:pPr>
+        <w:ind w:left="7200" w:hanging="360"/>
+      </w:pPr>
+      <w:rPr>
+        <w:rFonts w:ascii="Wingdings" w:hAnsi="Wingdings" w:hint="default"/>
+      </w:rPr>
+    </w:lvl>
+  </w:abstractNum>
+  <w:abstractNum w:abstractNumId="18" w15:restartNumberingAfterBreak="0">
     <w:nsid w:val="64BC556A"/>
     <w:multiLevelType w:val="hybridMultilevel"/>
     <w:tmpl w:val="1D326CE8"/>
@@ -2960,7 +4071,120 @@
       </w:rPr>
     </w:lvl>
   </w:abstractNum>
-  <w:abstractNum w:abstractNumId="14" w15:restartNumberingAfterBreak="0">
+  <w:abstractNum w:abstractNumId="19" w15:restartNumberingAfterBreak="0">
+    <w:nsid w:val="64F54BBE"/>
+    <w:multiLevelType w:val="multilevel"/>
+    <w:tmpl w:val="E346764E"/>
+    <w:lvl w:ilvl="0">
+      <w:start w:val="1"/>
+      <w:numFmt w:val="bullet"/>
+      <w:lvlText w:val=""/>
+      <w:lvlJc w:val="left"/>
+      <w:pPr>
+        <w:ind w:left="720" w:hanging="360"/>
+      </w:pPr>
+      <w:rPr>
+        <w:rFonts w:ascii="Symbol" w:hAnsi="Symbol" w:hint="default"/>
+      </w:rPr>
+    </w:lvl>
+    <w:lvl w:ilvl="1">
+      <w:start w:val="1"/>
+      <w:numFmt w:val="bullet"/>
+      <w:lvlText w:val="o"/>
+      <w:lvlJc w:val="left"/>
+      <w:pPr>
+        <w:ind w:left="1440" w:hanging="360"/>
+      </w:pPr>
+      <w:rPr>
+        <w:rFonts w:ascii="Courier New" w:hAnsi="Courier New" w:cs="Courier New" w:hint="default"/>
+      </w:rPr>
+    </w:lvl>
+    <w:lvl w:ilvl="2">
+      <w:start w:val="1"/>
+      <w:numFmt w:val="bullet"/>
+      <w:lvlText w:val=""/>
+      <w:lvlJc w:val="left"/>
+      <w:pPr>
+        <w:ind w:left="2160" w:hanging="360"/>
+      </w:pPr>
+      <w:rPr>
+        <w:rFonts w:ascii="Wingdings" w:hAnsi="Wingdings" w:hint="default"/>
+      </w:rPr>
+    </w:lvl>
+    <w:lvl w:ilvl="3">
+      <w:start w:val="1"/>
+      <w:numFmt w:val="bullet"/>
+      <w:lvlText w:val=""/>
+      <w:lvlJc w:val="left"/>
+      <w:pPr>
+        <w:ind w:left="2880" w:hanging="360"/>
+      </w:pPr>
+      <w:rPr>
+        <w:rFonts w:ascii="Symbol" w:hAnsi="Symbol" w:hint="default"/>
+      </w:rPr>
+    </w:lvl>
+    <w:lvl w:ilvl="4">
+      <w:start w:val="1"/>
+      <w:numFmt w:val="bullet"/>
+      <w:lvlText w:val="o"/>
+      <w:lvlJc w:val="left"/>
+      <w:pPr>
+        <w:ind w:left="3600" w:hanging="360"/>
+      </w:pPr>
+      <w:rPr>
+        <w:rFonts w:ascii="Courier New" w:hAnsi="Courier New" w:cs="Courier New" w:hint="default"/>
+      </w:rPr>
+    </w:lvl>
+    <w:lvl w:ilvl="5">
+      <w:start w:val="1"/>
+      <w:numFmt w:val="bullet"/>
+      <w:lvlText w:val=""/>
+      <w:lvlJc w:val="left"/>
+      <w:pPr>
+        <w:ind w:left="4320" w:hanging="360"/>
+      </w:pPr>
+      <w:rPr>
+        <w:rFonts w:ascii="Wingdings" w:hAnsi="Wingdings" w:hint="default"/>
+      </w:rPr>
+    </w:lvl>
+    <w:lvl w:ilvl="6">
+      <w:start w:val="1"/>
+      <w:numFmt w:val="bullet"/>
+      <w:lvlText w:val=""/>
+      <w:lvlJc w:val="left"/>
+      <w:pPr>
+        <w:ind w:left="5040" w:hanging="360"/>
+      </w:pPr>
+      <w:rPr>
+        <w:rFonts w:ascii="Symbol" w:hAnsi="Symbol" w:hint="default"/>
+      </w:rPr>
+    </w:lvl>
+    <w:lvl w:ilvl="7">
+      <w:start w:val="1"/>
+      <w:numFmt w:val="bullet"/>
+      <w:lvlText w:val="o"/>
+      <w:lvlJc w:val="left"/>
+      <w:pPr>
+        <w:ind w:left="5760" w:hanging="360"/>
+      </w:pPr>
+      <w:rPr>
+        <w:rFonts w:ascii="Courier New" w:hAnsi="Courier New" w:cs="Courier New" w:hint="default"/>
+      </w:rPr>
+    </w:lvl>
+    <w:lvl w:ilvl="8">
+      <w:start w:val="1"/>
+      <w:numFmt w:val="bullet"/>
+      <w:lvlText w:val=""/>
+      <w:lvlJc w:val="left"/>
+      <w:pPr>
+        <w:ind w:left="6480" w:hanging="360"/>
+      </w:pPr>
+      <w:rPr>
+        <w:rFonts w:ascii="Wingdings" w:hAnsi="Wingdings" w:hint="default"/>
+      </w:rPr>
+    </w:lvl>
+  </w:abstractNum>
+  <w:abstractNum w:abstractNumId="20" w15:restartNumberingAfterBreak="0">
     <w:nsid w:val="6EF04577"/>
     <w:multiLevelType w:val="hybridMultilevel"/>
     <w:tmpl w:val="734A36A8"/>
@@ -3073,7 +4297,7 @@
       </w:rPr>
     </w:lvl>
   </w:abstractNum>
-  <w:abstractNum w:abstractNumId="15" w15:restartNumberingAfterBreak="0">
+  <w:abstractNum w:abstractNumId="21" w15:restartNumberingAfterBreak="0">
     <w:nsid w:val="7355664C"/>
     <w:multiLevelType w:val="multilevel"/>
     <w:tmpl w:val="7355664C"/>
@@ -3188,7 +4412,7 @@
       </w:rPr>
     </w:lvl>
   </w:abstractNum>
-  <w:abstractNum w:abstractNumId="16" w15:restartNumberingAfterBreak="0">
+  <w:abstractNum w:abstractNumId="22" w15:restartNumberingAfterBreak="0">
     <w:nsid w:val="798114E8"/>
     <w:multiLevelType w:val="multilevel"/>
     <w:tmpl w:val="798114E8"/>
@@ -3274,7 +4498,120 @@
       </w:pPr>
     </w:lvl>
   </w:abstractNum>
-  <w:abstractNum w:abstractNumId="17" w15:restartNumberingAfterBreak="0">
+  <w:abstractNum w:abstractNumId="23" w15:restartNumberingAfterBreak="0">
+    <w:nsid w:val="7A2E0B5F"/>
+    <w:multiLevelType w:val="hybridMultilevel"/>
+    <w:tmpl w:val="4C7C8B86"/>
+    <w:lvl w:ilvl="0" w:tplc="04100001">
+      <w:start w:val="1"/>
+      <w:numFmt w:val="bullet"/>
+      <w:lvlText w:val=""/>
+      <w:lvlJc w:val="left"/>
+      <w:pPr>
+        <w:ind w:left="1140" w:hanging="360"/>
+      </w:pPr>
+      <w:rPr>
+        <w:rFonts w:ascii="Symbol" w:hAnsi="Symbol" w:hint="default"/>
+      </w:rPr>
+    </w:lvl>
+    <w:lvl w:ilvl="1" w:tplc="04100003">
+      <w:start w:val="1"/>
+      <w:numFmt w:val="bullet"/>
+      <w:lvlText w:val="o"/>
+      <w:lvlJc w:val="left"/>
+      <w:pPr>
+        <w:ind w:left="1860" w:hanging="360"/>
+      </w:pPr>
+      <w:rPr>
+        <w:rFonts w:ascii="Courier New" w:hAnsi="Courier New" w:cs="Courier New" w:hint="default"/>
+      </w:rPr>
+    </w:lvl>
+    <w:lvl w:ilvl="2" w:tplc="04100005">
+      <w:start w:val="1"/>
+      <w:numFmt w:val="bullet"/>
+      <w:lvlText w:val=""/>
+      <w:lvlJc w:val="left"/>
+      <w:pPr>
+        <w:ind w:left="2580" w:hanging="360"/>
+      </w:pPr>
+      <w:rPr>
+        <w:rFonts w:ascii="Wingdings" w:hAnsi="Wingdings" w:hint="default"/>
+      </w:rPr>
+    </w:lvl>
+    <w:lvl w:ilvl="3" w:tplc="04100001" w:tentative="1">
+      <w:start w:val="1"/>
+      <w:numFmt w:val="bullet"/>
+      <w:lvlText w:val=""/>
+      <w:lvlJc w:val="left"/>
+      <w:pPr>
+        <w:ind w:left="3300" w:hanging="360"/>
+      </w:pPr>
+      <w:rPr>
+        <w:rFonts w:ascii="Symbol" w:hAnsi="Symbol" w:hint="default"/>
+      </w:rPr>
+    </w:lvl>
+    <w:lvl w:ilvl="4" w:tplc="04100003" w:tentative="1">
+      <w:start w:val="1"/>
+      <w:numFmt w:val="bullet"/>
+      <w:lvlText w:val="o"/>
+      <w:lvlJc w:val="left"/>
+      <w:pPr>
+        <w:ind w:left="4020" w:hanging="360"/>
+      </w:pPr>
+      <w:rPr>
+        <w:rFonts w:ascii="Courier New" w:hAnsi="Courier New" w:cs="Courier New" w:hint="default"/>
+      </w:rPr>
+    </w:lvl>
+    <w:lvl w:ilvl="5" w:tplc="04100005" w:tentative="1">
+      <w:start w:val="1"/>
+      <w:numFmt w:val="bullet"/>
+      <w:lvlText w:val=""/>
+      <w:lvlJc w:val="left"/>
+      <w:pPr>
+        <w:ind w:left="4740" w:hanging="360"/>
+      </w:pPr>
+      <w:rPr>
+        <w:rFonts w:ascii="Wingdings" w:hAnsi="Wingdings" w:hint="default"/>
+      </w:rPr>
+    </w:lvl>
+    <w:lvl w:ilvl="6" w:tplc="04100001" w:tentative="1">
+      <w:start w:val="1"/>
+      <w:numFmt w:val="bullet"/>
+      <w:lvlText w:val=""/>
+      <w:lvlJc w:val="left"/>
+      <w:pPr>
+        <w:ind w:left="5460" w:hanging="360"/>
+      </w:pPr>
+      <w:rPr>
+        <w:rFonts w:ascii="Symbol" w:hAnsi="Symbol" w:hint="default"/>
+      </w:rPr>
+    </w:lvl>
+    <w:lvl w:ilvl="7" w:tplc="04100003" w:tentative="1">
+      <w:start w:val="1"/>
+      <w:numFmt w:val="bullet"/>
+      <w:lvlText w:val="o"/>
+      <w:lvlJc w:val="left"/>
+      <w:pPr>
+        <w:ind w:left="6180" w:hanging="360"/>
+      </w:pPr>
+      <w:rPr>
+        <w:rFonts w:ascii="Courier New" w:hAnsi="Courier New" w:cs="Courier New" w:hint="default"/>
+      </w:rPr>
+    </w:lvl>
+    <w:lvl w:ilvl="8" w:tplc="04100005" w:tentative="1">
+      <w:start w:val="1"/>
+      <w:numFmt w:val="bullet"/>
+      <w:lvlText w:val=""/>
+      <w:lvlJc w:val="left"/>
+      <w:pPr>
+        <w:ind w:left="6900" w:hanging="360"/>
+      </w:pPr>
+      <w:rPr>
+        <w:rFonts w:ascii="Wingdings" w:hAnsi="Wingdings" w:hint="default"/>
+      </w:rPr>
+    </w:lvl>
+  </w:abstractNum>
+  <w:abstractNum w:abstractNumId="24" w15:restartNumberingAfterBreak="0">
     <w:nsid w:val="7A4C77C6"/>
     <w:multiLevelType w:val="multilevel"/>
     <w:tmpl w:val="7A4C77C6"/>
@@ -3408,7 +4745,7 @@
     <w:abstractNumId w:val="5"/>
   </w:num>
   <w:num w:numId="6" w16cid:durableId="847326096">
-    <w:abstractNumId w:val="17"/>
+    <w:abstractNumId w:val="24"/>
   </w:num>
   <w:num w:numId="7" w16cid:durableId="221913860">
     <w:abstractNumId w:val="4"/>
@@ -3423,28 +4760,49 @@
     <w:abstractNumId w:val="1"/>
   </w:num>
   <w:num w:numId="11" w16cid:durableId="1701079014">
-    <w:abstractNumId w:val="12"/>
+    <w:abstractNumId w:val="15"/>
   </w:num>
   <w:num w:numId="12" w16cid:durableId="1817214210">
-    <w:abstractNumId w:val="11"/>
+    <w:abstractNumId w:val="13"/>
   </w:num>
   <w:num w:numId="13" w16cid:durableId="1806727826">
-    <w:abstractNumId w:val="16"/>
+    <w:abstractNumId w:val="22"/>
   </w:num>
   <w:num w:numId="14" w16cid:durableId="746151261">
     <w:abstractNumId w:val="10"/>
   </w:num>
   <w:num w:numId="15" w16cid:durableId="49810080">
-    <w:abstractNumId w:val="15"/>
+    <w:abstractNumId w:val="21"/>
   </w:num>
   <w:num w:numId="16" w16cid:durableId="1080054167">
     <w:abstractNumId w:val="0"/>
   </w:num>
   <w:num w:numId="17" w16cid:durableId="1679037156">
+    <w:abstractNumId w:val="20"/>
+  </w:num>
+  <w:num w:numId="18" w16cid:durableId="81461887">
+    <w:abstractNumId w:val="18"/>
+  </w:num>
+  <w:num w:numId="19" w16cid:durableId="89160184">
+    <w:abstractNumId w:val="17"/>
+  </w:num>
+  <w:num w:numId="20" w16cid:durableId="2046438668">
     <w:abstractNumId w:val="14"/>
   </w:num>
-  <w:num w:numId="18" w16cid:durableId="81461887">
-    <w:abstractNumId w:val="13"/>
+  <w:num w:numId="21" w16cid:durableId="604847167">
+    <w:abstractNumId w:val="23"/>
+  </w:num>
+  <w:num w:numId="22" w16cid:durableId="2027513915">
+    <w:abstractNumId w:val="19"/>
+  </w:num>
+  <w:num w:numId="23" w16cid:durableId="1163012718">
+    <w:abstractNumId w:val="12"/>
+  </w:num>
+  <w:num w:numId="24" w16cid:durableId="1067725895">
+    <w:abstractNumId w:val="11"/>
+  </w:num>
+  <w:num w:numId="25" w16cid:durableId="202524470">
+    <w:abstractNumId w:val="16"/>
   </w:num>
 </w:numbering>
 </file>
@@ -27838,10 +29196,6 @@
 </file>
 
 <file path=customXml/item1.xml><?xml version="1.0" encoding="utf-8"?>
-<b:Sources xmlns:b="http://schemas.openxmlformats.org/officeDocument/2006/bibliography" xmlns="http://schemas.openxmlformats.org/officeDocument/2006/bibliography" SelectedStyle="\APASixthEditionOfficeOnline.xsl" StyleName="APA" Version="6"/>
-</file>
-
-<file path=customXml/item2.xml><?xml version="1.0" encoding="utf-8"?>
 <s:customData xmlns="http://www.wps.cn/officeDocument/2013/wpsCustomData" xmlns:s="http://www.wps.cn/officeDocument/2013/wpsCustomData">
   <customSectProps>
     <customSectPr/>
@@ -27852,18 +29206,22 @@
 </s:customData>
 </file>
 
+<file path=customXml/item2.xml><?xml version="1.0" encoding="utf-8"?>
+<b:Sources xmlns:b="http://schemas.openxmlformats.org/officeDocument/2006/bibliography" xmlns="http://schemas.openxmlformats.org/officeDocument/2006/bibliography" SelectedStyle="\APASixthEditionOfficeOnline.xsl" StyleName="APA" Version="6"/>
+</file>
+
 <file path=customXml/itemProps1.xml><?xml version="1.0" encoding="utf-8"?>
+<ds:datastoreItem xmlns:ds="http://schemas.openxmlformats.org/officeDocument/2006/customXml" ds:itemID="{B1977F7D-205B-4081-913C-38D41E755F92}">
+  <ds:schemaRefs>
+    <ds:schemaRef ds:uri="http://www.wps.cn/officeDocument/2013/wpsCustomData"/>
+  </ds:schemaRefs>
+</ds:datastoreItem>
+</file>
+
+<file path=customXml/itemProps2.xml><?xml version="1.0" encoding="utf-8"?>
 <ds:datastoreItem xmlns:ds="http://schemas.openxmlformats.org/officeDocument/2006/customXml" ds:itemID="{A72CEA73-14BE-4245-AF71-CBEF4454A017}">
   <ds:schemaRefs>
     <ds:schemaRef ds:uri="http://schemas.openxmlformats.org/officeDocument/2006/bibliography"/>
   </ds:schemaRefs>
 </ds:datastoreItem>
-</file>
-
-<file path=customXml/itemProps2.xml><?xml version="1.0" encoding="utf-8"?>
-<ds:datastoreItem xmlns:ds="http://schemas.openxmlformats.org/officeDocument/2006/customXml" ds:itemID="{B1977F7D-205B-4081-913C-38D41E755F92}">
-  <ds:schemaRefs>
-    <ds:schemaRef ds:uri="http://www.wps.cn/officeDocument/2013/wpsCustomData"/>
-  </ds:schemaRefs>
-</ds:datastoreItem>
 </file>
</xml_diff>